<commit_message>
Fix proposal references [4] and [7]; add reference check and new ACO sources
</commit_message>
<xml_diff>
--- a/docs/class_proposal.docx
+++ b/docs/class_proposal.docx
@@ -1,6 +1,6 @@
 
 <file path=word/document.xml><?xml version="1.0" encoding="utf-8"?>
-<w:document xmlns:wpc="http://schemas.microsoft.com/office/word/2010/wordprocessingCanvas" xmlns:cx="http://schemas.microsoft.com/office/drawing/2014/chartex" xmlns:cx1="http://schemas.microsoft.com/office/drawing/2015/9/8/chartex" xmlns:cx2="http://schemas.microsoft.com/office/drawing/2015/10/21/chartex" xmlns:cx3="http://schemas.microsoft.com/office/drawing/2016/5/9/chartex" xmlns:cx4="http://schemas.microsoft.com/office/drawing/2016/5/10/chartex" xmlns:cx5="http://schemas.microsoft.com/office/drawing/2016/5/11/chartex" xmlns:cx6="http://schemas.microsoft.com/office/drawing/2016/5/12/chartex" xmlns:cx7="http://schemas.microsoft.com/office/drawing/2016/5/13/chartex" xmlns:cx8="http://schemas.microsoft.com/office/drawing/2016/5/14/chartex" xmlns:mc="http://schemas.openxmlformats.org/markup-compatibility/2006" xmlns:m="http://schemas.openxmlformats.org/officeDocument/2006/math" xmlns:aink="http://schemas.microsoft.com/office/drawing/2016/ink" xmlns:am3d="http://schemas.microsoft.com/office/drawing/2017/model3d" xmlns:oel="http://schemas.microsoft.com/office/2019/extlst" xmlns:r="http://schemas.openxmlformats.org/officeDocument/2006/relationships" xmlns:wp14="http://schemas.microsoft.com/office/word/2010/wordprocessingDrawing" xmlns:wp="http://schemas.openxmlformats.org/drawingml/2006/wordprocessingDrawing" xmlns:wpg="http://schemas.microsoft.com/office/word/2010/wordprocessingGroup" xmlns:wpi="http://schemas.microsoft.com/office/word/2010/wordprocessingInk" xmlns:wps="http://schemas.microsoft.com/office/word/2010/wordprocessingShape" xmlns:o="urn:schemas-microsoft-com:office:office" xmlns:v="urn:schemas-microsoft-com:vml" xmlns:w10="urn:schemas-microsoft-com:office:word" xmlns:w="http://schemas.openxmlformats.org/wordprocessingml/2006/main" xmlns:w14="http://schemas.microsoft.com/office/word/2010/wordml" xmlns:w15="http://schemas.microsoft.com/office/word/2012/wordml" xmlns:w16cei="http://schemas.microsoft.com/office/word/2026/wordml/cei" xmlns:w16cex="http://schemas.microsoft.com/office/word/2018/wordml/cex" xmlns:w16cid="http://schemas.microsoft.com/office/word/2016/wordml/cid" xmlns:w16="http://schemas.microsoft.com/office/word/2018/wordml" xmlns:w16sdtdh="http://schemas.microsoft.com/office/word/2020/wordml/sdtdatahash" xmlns:w16sdtfl="http://schemas.microsoft.com/office/word/2024/wordml/sdtformatlock" xmlns:w16se="http://schemas.microsoft.com/office/word/2015/wordml/symex" xmlns:w16du="http://schemas.microsoft.com/office/word/2023/wordml/word16du" xmlns:wne="http://schemas.microsoft.com/office/word/2006/wordml" mc:Ignorable="w14 w15 w16se w16cid w16 w16cex w16sdtdh w16sdtfl w16du wp14">
+<w:document xmlns:wpc="http://schemas.microsoft.com/office/word/2010/wordprocessingCanvas" xmlns:cx="http://schemas.microsoft.com/office/drawing/2014/chartex" xmlns:cx1="http://schemas.microsoft.com/office/drawing/2015/9/8/chartex" xmlns:cx2="http://schemas.microsoft.com/office/drawing/2015/10/21/chartex" xmlns:cx3="http://schemas.microsoft.com/office/drawing/2016/5/9/chartex" xmlns:cx4="http://schemas.microsoft.com/office/drawing/2016/5/10/chartex" xmlns:cx5="http://schemas.microsoft.com/office/drawing/2016/5/11/chartex" xmlns:cx6="http://schemas.microsoft.com/office/drawing/2016/5/12/chartex" xmlns:cx7="http://schemas.microsoft.com/office/drawing/2016/5/13/chartex" xmlns:cx8="http://schemas.microsoft.com/office/drawing/2016/5/14/chartex" xmlns:mc="http://schemas.openxmlformats.org/markup-compatibility/2006" xmlns:aink="http://schemas.microsoft.com/office/drawing/2016/ink" xmlns:am3d="http://schemas.microsoft.com/office/drawing/2017/model3d" xmlns:o="urn:schemas-microsoft-com:office:office" xmlns:r="http://schemas.openxmlformats.org/officeDocument/2006/relationships" xmlns:m="http://schemas.openxmlformats.org/officeDocument/2006/math" xmlns:v="urn:schemas-microsoft-com:vml" xmlns:wp14="http://schemas.microsoft.com/office/word/2010/wordprocessingDrawing" xmlns:wp="http://schemas.openxmlformats.org/drawingml/2006/wordprocessingDrawing" xmlns:w10="urn:schemas-microsoft-com:office:word" xmlns:w="http://schemas.openxmlformats.org/wordprocessingml/2006/main" xmlns:w14="http://schemas.microsoft.com/office/word/2010/wordml" xmlns:w15="http://schemas.microsoft.com/office/word/2012/wordml" xmlns:w16cid="http://schemas.microsoft.com/office/word/2016/wordml/cid" xmlns:w16se="http://schemas.microsoft.com/office/word/2015/wordml/symex" xmlns:wpg="http://schemas.microsoft.com/office/word/2010/wordprocessingGroup" xmlns:wpi="http://schemas.microsoft.com/office/word/2010/wordprocessingInk" xmlns:wne="http://schemas.microsoft.com/office/word/2006/wordml" xmlns:wps="http://schemas.microsoft.com/office/word/2010/wordprocessingShape" mc:Ignorable="w14 w15 w16se w16cid wp14">
   <w:body>
     <w:p>
       <w:pPr>
@@ -73,7 +73,19 @@
         <w:rPr>
           <w:color w:val="262626"/>
         </w:rPr>
-        <w:t>The Transiting Exoplanet Survey Satellite (TESS) has recorded the brightness of hundreds of thousands of stars over time [4]. Finding planets means searching each star’s light curve for small, periodic dips. This search can take substantial processing time, but each star can be checked independently. Volunteer computing lets projects distribute work across donated m</w:t>
+        <w:t xml:space="preserve">The </w:t>
+      </w:r>
+      <w:r>
+        <w:rPr>
+          <w:color w:val="262626"/>
+        </w:rPr>
+        <w:t>Transiting Exoplanet Survey Satellite (TESS) has recorded the brightness of hundreds of thousands of stars over time [4]. Finding planets means searching each star’s light curve for small, periodic dips. This search can take substantial processing time, bu</w:t>
+      </w:r>
+      <w:r>
+        <w:rPr>
+          <w:color w:val="262626"/>
+        </w:rPr>
+        <w:t>t each star can be checked independently. Volunteer computing lets projects distribute work across donated m</w:t>
       </w:r>
       <w:r>
         <w:rPr>
@@ -99,7 +111,13 @@
         <w:rPr>
           <w:color w:val="262626"/>
         </w:rPr>
-        <w:t xml:space="preserve"> and BOINC demonstrate [3]. These machines vary in speed and network quality. They may disconnect without warning or return incorrect results, so scheduling must account for more than how many workers are available.</w:t>
+        <w:t xml:space="preserve"> and BOINC demonstrate [3]. These machines vary in speed and network quality. They may disconnect without warning or return inc</w:t>
+      </w:r>
+      <w:r>
+        <w:rPr>
+          <w:color w:val="262626"/>
+        </w:rPr>
+        <w:t>orrect results, so scheduling must account for more than how many workers are available.</w:t>
       </w:r>
     </w:p>
     <w:p>
@@ -129,25 +147,19 @@
         <w:rPr>
           <w:color w:val="262626"/>
         </w:rPr>
-        <w:t>, where ants coordinate indirectly by laying and following pheromone trails [6</w:t>
+        <w:t>, where ants coordinate indirectly by laying and following pheromone trails [6]. The coordinator keeps a pheromone score for each worker</w:t>
       </w:r>
       <w:r>
         <w:rPr>
           <w:color w:val="262626"/>
         </w:rPr>
-        <w:t xml:space="preserve">]. The coordinator keeps a pheromone score for each worker. Scores rise when a worker returns a fast, validated result and fade </w:t>
+        <w:t xml:space="preserve">. Scores rise when a worker returns a fast, validated result and fade overtime. Assignment probabilities depend on these scores, following ant colony optimization [1, 2]. Each star is sent to at least two workers. If their results disagree, a third worker </w:t>
       </w:r>
       <w:r>
         <w:rPr>
           <w:color w:val="262626"/>
         </w:rPr>
-        <w:t>overtime</w:t>
-      </w:r>
-      <w:r>
-        <w:rPr>
-          <w:color w:val="262626"/>
-        </w:rPr>
-        <w:t xml:space="preserve">. Assignment probabilities depend on these scores, following ant colony optimization [1, 2]. Each star is sent to at least two workers. If their results disagree, a third worker runs the task; unresolved disagreements are flagged for review. We will compare </w:t>
+        <w:t xml:space="preserve">runs the task; unresolved disagreements are flagged for review. We will compare </w:t>
       </w:r>
       <w:proofErr w:type="spellStart"/>
       <w:r>
@@ -161,7 +173,13 @@
         <w:rPr>
           <w:color w:val="262626"/>
         </w:rPr>
-        <w:t xml:space="preserve"> against round-robin, random, and greedy schedulers under controlled slowdowns and failures, and on team members’ own computers. We will also measure how many known TESS planets the pipeline rediscovers.</w:t>
+        <w:t xml:space="preserve"> against round-robin, random, and greedy schedulers under controlled slowdowns and failures, and on team members’ own computers. We will also measure how many known TE</w:t>
+      </w:r>
+      <w:r>
+        <w:rPr>
+          <w:color w:val="262626"/>
+        </w:rPr>
+        <w:t>SS planets the pipeline rediscovers.</w:t>
       </w:r>
     </w:p>
     <w:p>
@@ -177,7 +195,13 @@
         <w:rPr>
           <w:color w:val="262626"/>
         </w:rPr>
-        <w:t>If the approach works, volunteer projects could get more useful work out of uneven computers without benchmarking them first. The TESS search will let us assess whether this scheduling approach supports reliable processing of public scientific data.</w:t>
+        <w:t>If the approach works, volunteer projects could get more useful work out of uneven computers without benchmarking them first. The TESS search will let us assess whether this scheduling approach supports reliable process</w:t>
+      </w:r>
+      <w:r>
+        <w:rPr>
+          <w:color w:val="262626"/>
+        </w:rPr>
+        <w:t>ing of public scientific data.</w:t>
       </w:r>
     </w:p>
     <w:p>
@@ -354,7 +378,13 @@
         <w:rPr>
           <w:color w:val="262626"/>
         </w:rPr>
-        <w:t>Volunteer computers vary in speed and may disconnect before finishing a task, making it difficult to schedule a TESS transit search without wasting work. Our goal is a Python volunteer-computing system that adapts task assignments as worker performance and availability change.</w:t>
+        <w:t>Volunteer computers vary in speed and may disconnect befor</w:t>
+      </w:r>
+      <w:r>
+        <w:rPr>
+          <w:color w:val="262626"/>
+        </w:rPr>
+        <w:t>e finishing a task, making it difficult to schedule a TESS transit search without wasting work. Our goal is a Python volunteer-computing system that adapts task assignments as worker performance and availability change.</w:t>
       </w:r>
     </w:p>
     <w:p>
@@ -373,7 +403,13 @@
         <w:rPr>
           <w:color w:val="262626"/>
         </w:rPr>
-        <w:t xml:space="preserve">A central coordinator splits the search into one task per star and sends each task to at least two volunteer workers, which </w:t>
+        <w:t>A central coordinator splits the sea</w:t>
+      </w:r>
+      <w:r>
+        <w:rPr>
+          <w:color w:val="262626"/>
+        </w:rPr>
+        <w:t xml:space="preserve">rch into one task per star and sends each task to at least two volunteer workers, which </w:t>
       </w:r>
       <w:r>
         <w:rPr>
@@ -397,7 +433,13 @@
         <w:rPr>
           <w:color w:val="262626"/>
         </w:rPr>
-        <w:t xml:space="preserve"> stellar variability, and run a Box Least Squares transit search [5]. Instead of a fixed assignment rule, the coordinator uses an ant colony scheduler: workers earn pheromone scores for fast, validated results, scores fade over time, and tasks go preferentially to high-scoring workers. Redundant execution of each task lets us validate results and detect faulty workers.</w:t>
+        <w:t xml:space="preserve"> stellar variability, and run a Box Least Squares transit search [5]. Instead of a fixed assignment rule, the coordinator uses an ant </w:t>
+      </w:r>
+      <w:r>
+        <w:rPr>
+          <w:color w:val="262626"/>
+        </w:rPr>
+        <w:t>colony scheduler: workers earn pheromone scores for fast, validated results, scores fade over time, and tasks go preferentially to high-scoring workers. Redundant execution of each task lets us validate results and detect faulty workers.</w:t>
       </w:r>
     </w:p>
     <w:p>
@@ -416,7 +458,19 @@
         <w:rPr>
           <w:color w:val="262626"/>
         </w:rPr>
-        <w:t>The distinctive part of our proposal is adapting ant colony optimization to volunteer-worker scheduling and testing it on a real TESS transit search. Unlike a fixed assignment rule, our scheduler updates its worker scores from completed tasks, so later assignments reflect how the machines have performed. Combining this feedback with result validation lets us study scheduling performance alongside the reliability of the scientific outputs.</w:t>
+        <w:t>The distinctive pa</w:t>
+      </w:r>
+      <w:r>
+        <w:rPr>
+          <w:color w:val="262626"/>
+        </w:rPr>
+        <w:t>rt of our proposal is adapting ant colony optimization to volunteer-worker scheduling and testing it on a real TESS transit search. Unlike a fixed assignment rule, our scheduler updates its worker scores from completed tasks, so later assignments reflect h</w:t>
+      </w:r>
+      <w:r>
+        <w:rPr>
+          <w:color w:val="262626"/>
+        </w:rPr>
+        <w:t>ow the machines have performed. Combining this feedback with result validation lets us study scheduling performance alongside the reliability of the scientific outputs.</w:t>
       </w:r>
     </w:p>
     <w:p>
@@ -563,7 +617,13 @@
         <w:rPr>
           <w:color w:val="262626"/>
         </w:rPr>
-        <w:t xml:space="preserve"> and Redis so we can implement the scheduling logic ourselves and switch between algorithms. Docker will let us limit CPU resources and stop workers during tests; network-delay injection will simulate poor connections. These controls will help us repeat the experiments under the same conditions.</w:t>
+        <w:t xml:space="preserve"> and Redis so we can implement the schedulin</w:t>
+      </w:r>
+      <w:r>
+        <w:rPr>
+          <w:color w:val="262626"/>
+        </w:rPr>
+        <w:t>g logic ourselves and switch between algorithms. Docker will let us limit CPU resources and stop workers during tests; network-delay injection will simulate poor connections. These controls will help us repeat the experiments under the same conditions.</w:t>
       </w:r>
     </w:p>
     <w:p>
@@ -577,7 +637,10 @@
       <w:bookmarkStart w:id="4" w:name="_xpfdfi6rdbnx"/>
       <w:bookmarkEnd w:id="4"/>
       <w:r>
-        <w:t>Expected Results</w:t>
+        <w:t>Exp</w:t>
+      </w:r>
+      <w:r>
+        <w:t>ected Results</w:t>
       </w:r>
     </w:p>
     <w:p>
@@ -596,7 +659,19 @@
         <w:rPr>
           <w:color w:val="262626"/>
         </w:rPr>
-        <w:t>First, we will build a single-star prototype that recovers the orbital period of a known TESS planet. Next, we will process 50 to 100 stars through the coordinator with a simple round-robin scheduler. We will then add result validation through redundant execution, a failure-injection tool, and the random and greedy baseline schedulers. After implementing the ant colony scheduler, we will use a small parameter sweep to tune its deposit and evaporation rates. Finally, we will run experiments with identical, uneven, and failing workers, plus one run across team members’ own computers.</w:t>
+        <w:t>First, we will build a single-star prototype that recovers the orbital period of a known TESS planet. Next, we will process 50 to 100 stars through the coordinator with a simple round-robin scheduler. We will then add result validation throug</w:t>
+      </w:r>
+      <w:r>
+        <w:rPr>
+          <w:color w:val="262626"/>
+        </w:rPr>
+        <w:t>h redundant execution, a failure-injection tool, and the random and greedy baseline schedulers. After implementing the ant colony scheduler, we will use a small parameter sweep to tune its deposit and evaporation rates. Finally, we will run experiments wit</w:t>
+      </w:r>
+      <w:r>
+        <w:rPr>
+          <w:color w:val="262626"/>
+        </w:rPr>
+        <w:t>h identical, uneven, and failing workers, plus one run across team members’ own computers.</w:t>
       </w:r>
     </w:p>
     <w:p>
@@ -629,14 +704,26 @@
         <w:rPr>
           <w:color w:val="262626"/>
         </w:rPr>
-        <w:t xml:space="preserve">, a documented Python package containing the coordinator, worker, scheduler, and failure-injection components, published in our GitHub repository. We will deliver an experimental comparison of the four schedulers measuring completion time, throughput, wasted work, recovery time after failures, and faulty results </w:t>
+        <w:t>, a documented Python package containing the coordinator, worker, scheduler, and failure-injection components, published in our GitH</w:t>
+      </w:r>
+      <w:r>
+        <w:rPr>
+          <w:color w:val="262626"/>
+        </w:rPr>
+        <w:t xml:space="preserve">ub repository. We will deliver an experimental comparison of the four schedulers measuring completion time, throughput, wasted work, recovery time after failures, and faulty results </w:t>
       </w:r>
       <w:r>
         <w:rPr>
           <w:color w:val="262626"/>
         </w:rPr>
         <w:lastRenderedPageBreak/>
-        <w:t>caught. We will also report scientific accuracy as the share of known TESS planets whose orbital periods the pipeline recovers, listing promising signals separately as unconfirmed. A final report and live demo will show the scheduler adapting as workers slow down or drop out.</w:t>
+        <w:t>caught. We will also report scientific accuracy as the share of known TESS</w:t>
+      </w:r>
+      <w:r>
+        <w:rPr>
+          <w:color w:val="262626"/>
+        </w:rPr>
+        <w:t xml:space="preserve"> planets whose orbital periods the pipeline recovers, listing promising signals separately as unconfirmed. A final report and live demo will show the scheduler adapting as workers slow down or drop out.</w:t>
       </w:r>
     </w:p>
     <w:p>
@@ -669,7 +756,19 @@
         <w:rPr>
           <w:color w:val="262626"/>
         </w:rPr>
-        <w:t>The project uses core course topics including task distribution, scheduling, replication, fault tolerance, and coordination among unreliable nodes. Volunteer computing is a demanding distributed setting because the system cannot control the machines or when they are available, so we can measure how our design choices affect performance.</w:t>
+        <w:t>The project uses core course topics includ</w:t>
+      </w:r>
+      <w:r>
+        <w:rPr>
+          <w:color w:val="262626"/>
+        </w:rPr>
+        <w:t>ing task distribution, scheduling, replication, fault tolerance, and coordination among unreliable nodes. Volunteer computing is a demanding distributed setting because the system cannot control the machines or when they are available, so we can measure ho</w:t>
+      </w:r>
+      <w:r>
+        <w:rPr>
+          <w:color w:val="262626"/>
+        </w:rPr>
+        <w:t>w our design choices affect performance.</w:t>
       </w:r>
     </w:p>
     <w:p>
@@ -721,7 +820,13 @@
         <w:rPr>
           <w:color w:val="262626"/>
         </w:rPr>
-        <w:t>Future directions, scalability, and real-world application: The same design could process archival Kepler data or other scientific workloads that split into independent tasks. A larger deployment would need tests of the coordinator’s queue capacity and the extra work required for result validation. Future work could explore peer-to-peer coordination if the central coordinator becomes a bottleneck.</w:t>
+        <w:t xml:space="preserve">Future directions, scalability, and real-world application: The same design could process archival Kepler data or other scientific workloads that split into independent tasks. A larger deployment would need tests of </w:t>
+      </w:r>
+      <w:r>
+        <w:rPr>
+          <w:color w:val="262626"/>
+        </w:rPr>
+        <w:t>the coordinator’s queue capacity and the extra work required for result validation. Future work could explore peer-to-peer coordination if the central coordinator becomes a bottleneck.</w:t>
       </w:r>
     </w:p>
     <w:p>
@@ -791,7 +896,13 @@
         <w:rPr>
           <w:color w:val="262626"/>
         </w:rPr>
-        <w:t>, A. (1996). Ant system: Optimization by a colony of cooperating agents. IEEE Transactions on Systems, Man, and Cybernetics, Part B</w:t>
+        <w:t>, A. (1996). Ant sy</w:t>
+      </w:r>
+      <w:r>
+        <w:rPr>
+          <w:color w:val="262626"/>
+        </w:rPr>
+        <w:t>stem: Optimization by a colony of cooperating agents. IEEE Transactions on Systems, Man, and Cybernetics, Part B</w:t>
       </w:r>
       <w:r>
         <w:rPr>
@@ -826,7 +937,13 @@
         <w:rPr>
           <w:color w:val="262626"/>
         </w:rPr>
-        <w:t>[2] Dorigo, M., &amp; Gambardella, L. M. (1997). Ant colony system: A cooperative learning approach to the traveling salesman problem. IEEE Transactions on Evolutionary Computation, 1(1), 53–66.</w:t>
+        <w:t xml:space="preserve">[2] Dorigo, M., &amp; Gambardella, L. M. (1997). Ant colony system: A cooperative </w:t>
+      </w:r>
+      <w:r>
+        <w:rPr>
+          <w:color w:val="262626"/>
+        </w:rPr>
+        <w:t>learning approach to the traveling salesman problem. IEEE Transactions on Evolutionary Computation, 1(1), 53–66.</w:t>
       </w:r>
       <w:r>
         <w:rPr>
@@ -861,7 +978,13 @@
         <w:rPr>
           <w:color w:val="262626"/>
         </w:rPr>
-        <w:t>Proceedings of the Fifth IEEE/ACM International Workshop on Grid Computing</w:t>
+        <w:t>Proceedings of th</w:t>
+      </w:r>
+      <w:r>
+        <w:rPr>
+          <w:color w:val="262626"/>
+        </w:rPr>
+        <w:t>e Fifth IEEE/ACM International Workshop on Grid Computing</w:t>
       </w:r>
       <w:r>
         <w:rPr>
@@ -902,13 +1025,35 @@
         <w:rPr>
           <w:color w:val="262626"/>
         </w:rPr>
-        <w:t>2014</w:t>
+        <w:t>201</w:t>
+      </w:r>
+      <w:ins w:id="7" w:author="Jessica Lewis" w:date="2026-10-19T15:27:00Z">
+        <w:r>
+          <w:rPr>
+            <w:color w:val="262626"/>
+          </w:rPr>
+          <w:t>5</w:t>
+        </w:r>
+      </w:ins>
+      <w:del w:id="8" w:author="Jessica Lewis" w:date="2026-10-19T15:27:00Z">
+        <w:r>
+          <w:rPr>
+            <w:color w:val="262626"/>
+          </w:rPr>
+          <w:delText>4</w:delText>
+        </w:r>
+      </w:del>
+      <w:r>
+        <w:rPr>
+          <w:color w:val="262626"/>
+        </w:rPr>
+        <w:t>). Transiting Exoplanet Survey Satellite. Journal of Astronomical Telescopes, Instruments, and Systems, 1(1), 01</w:t>
       </w:r>
       <w:r>
         <w:rPr>
           <w:color w:val="262626"/>
         </w:rPr>
-        <w:t>). Transiting Exoplanet Survey Satellite. Journal of Astronomical Telescopes, Instruments, and Systems, 1(1), 014003.</w:t>
+        <w:t>4003.</w:t>
       </w:r>
       <w:r>
         <w:rPr>
@@ -966,26 +1111,20 @@
         <w:rPr>
           <w:color w:val="262626"/>
         </w:rPr>
-        <w:t>[</w:t>
-      </w:r>
-      <w:r>
-        <w:rPr>
-          <w:color w:val="262626"/>
-        </w:rPr>
-        <w:t>6</w:t>
-      </w:r>
-      <w:r>
-        <w:rPr>
-          <w:color w:val="262626"/>
-        </w:rPr>
-        <w:t xml:space="preserve">] </w:t>
+        <w:t xml:space="preserve">[6] </w:t>
       </w:r>
       <w:proofErr w:type="spellStart"/>
       <w:r>
         <w:rPr>
           <w:color w:val="262626"/>
         </w:rPr>
-        <w:t>Deneubourg</w:t>
+        <w:t>Deneubou</w:t>
+      </w:r>
+      <w:r>
+        <w:rPr>
+          <w:color w:val="262626"/>
+        </w:rPr>
+        <w:t>rg</w:t>
       </w:r>
       <w:proofErr w:type="spellEnd"/>
       <w:r>
@@ -1069,8 +1208,28 @@
         <w:rPr>
           <w:color w:val="262626"/>
         </w:rPr>
-        <w:t>: Kepler and TESS time series analysis in Python. Astrophysics Source Code Library, ascl:1812.013.</w:t>
+        <w:t>: Ke</w:t>
       </w:r>
+      <w:r>
+        <w:rPr>
+          <w:color w:val="262626"/>
+        </w:rPr>
+        <w:t>pler and TESS time series analysis in Python. Astrophysics Source Code Library, ascl:1812.013.</w:t>
+      </w:r>
+      <w:ins w:id="9" w:author="Jessica Lewis" w:date="2026-10-19T15:50:00Z">
+        <w:r>
+          <w:rPr>
+            <w:color w:val="262626"/>
+          </w:rPr>
+          <w:t xml:space="preserve"> </w:t>
+        </w:r>
+        <w:r>
+          <w:rPr>
+            <w:color w:val="262626"/>
+          </w:rPr>
+          <w:t>https://ascl.net/1812.013</w:t>
+        </w:r>
+      </w:ins>
     </w:p>
     <w:p>
       <w:pPr>
@@ -1086,19 +1245,7 @@
         <w:rPr>
           <w:color w:val="262626"/>
         </w:rPr>
-        <w:t>[</w:t>
-      </w:r>
-      <w:r>
-        <w:rPr>
-          <w:color w:val="262626"/>
-        </w:rPr>
-        <w:t>8</w:t>
-      </w:r>
-      <w:r>
-        <w:rPr>
-          <w:color w:val="262626"/>
-        </w:rPr>
-        <w:t xml:space="preserve">] </w:t>
+        <w:t xml:space="preserve">[8] </w:t>
       </w:r>
       <w:proofErr w:type="spellStart"/>
       <w:r>
@@ -1126,7 +1273,21 @@
         <w:rPr>
           <w:color w:val="262626"/>
         </w:rPr>
-        <w:t xml:space="preserve"> Project: Sustaining and growing a community-oriented open-source project and the latest major release (v5.0) of the core package. The Astrophysical Journal, 935(2), 167.</w:t>
+        <w:t xml:space="preserve"> Project: Sustaining and growing a community-oriented open-source project and the latest major release (v5.0</w:t>
+      </w:r>
+      <w:r>
+        <w:rPr>
+          <w:color w:val="262626"/>
+        </w:rPr>
+        <w:t>) of the core package. The Astrophysical Journal, 935</w:t>
+      </w:r>
+      <w:bookmarkStart w:id="10" w:name="_GoBack"/>
+      <w:bookmarkEnd w:id="10"/>
+      <w:r>
+        <w:rPr>
+          <w:color w:val="262626"/>
+        </w:rPr>
+        <w:t>(2), 167.</w:t>
       </w:r>
       <w:r>
         <w:rPr>
@@ -1136,12 +1297,12 @@
       </w:r>
     </w:p>
     <w:sectPr>
-      <w:headerReference w:type="even" r:id="rId7"/>
-      <w:headerReference w:type="default" r:id="rId8"/>
-      <w:footerReference w:type="even" r:id="rId9"/>
-      <w:footerReference w:type="default" r:id="rId10"/>
-      <w:headerReference w:type="first" r:id="rId11"/>
-      <w:footerReference w:type="first" r:id="rId12"/>
+      <w:headerReference w:type="even" r:id="rId10"/>
+      <w:headerReference w:type="default" r:id="rId11"/>
+      <w:footerReference w:type="even" r:id="rId12"/>
+      <w:footerReference w:type="default" r:id="rId13"/>
+      <w:headerReference w:type="first" r:id="rId14"/>
+      <w:footerReference w:type="first" r:id="rId15"/>
       <w:pgSz w:w="12240" w:h="15840"/>
       <w:pgMar w:top="1440" w:right="1440" w:bottom="1440" w:left="1440" w:header="720" w:footer="0" w:gutter="0"/>
       <w:pgNumType w:start="1"/>
@@ -1152,7 +1313,7 @@
 </file>
 
 <file path=word/endnotes.xml><?xml version="1.0" encoding="utf-8"?>
-<w:endnotes xmlns:wpc="http://schemas.microsoft.com/office/word/2010/wordprocessingCanvas" xmlns:cx="http://schemas.microsoft.com/office/drawing/2014/chartex" xmlns:cx1="http://schemas.microsoft.com/office/drawing/2015/9/8/chartex" xmlns:cx2="http://schemas.microsoft.com/office/drawing/2015/10/21/chartex" xmlns:cx3="http://schemas.microsoft.com/office/drawing/2016/5/9/chartex" xmlns:cx4="http://schemas.microsoft.com/office/drawing/2016/5/10/chartex" xmlns:cx5="http://schemas.microsoft.com/office/drawing/2016/5/11/chartex" xmlns:cx6="http://schemas.microsoft.com/office/drawing/2016/5/12/chartex" xmlns:cx7="http://schemas.microsoft.com/office/drawing/2016/5/13/chartex" xmlns:cx8="http://schemas.microsoft.com/office/drawing/2016/5/14/chartex" xmlns:mc="http://schemas.openxmlformats.org/markup-compatibility/2006" xmlns:m="http://schemas.openxmlformats.org/officeDocument/2006/math" xmlns:aink="http://schemas.microsoft.com/office/drawing/2016/ink" xmlns:am3d="http://schemas.microsoft.com/office/drawing/2017/model3d" xmlns:oel="http://schemas.microsoft.com/office/2019/extlst" xmlns:r="http://schemas.openxmlformats.org/officeDocument/2006/relationships" xmlns:wp14="http://schemas.microsoft.com/office/word/2010/wordprocessingDrawing" xmlns:wp="http://schemas.openxmlformats.org/drawingml/2006/wordprocessingDrawing" xmlns:wpg="http://schemas.microsoft.com/office/word/2010/wordprocessingGroup" xmlns:wpi="http://schemas.microsoft.com/office/word/2010/wordprocessingInk" xmlns:wps="http://schemas.microsoft.com/office/word/2010/wordprocessingShape" xmlns:o="urn:schemas-microsoft-com:office:office" xmlns:v="urn:schemas-microsoft-com:vml" xmlns:w10="urn:schemas-microsoft-com:office:word" xmlns:w="http://schemas.openxmlformats.org/wordprocessingml/2006/main" xmlns:w14="http://schemas.microsoft.com/office/word/2010/wordml" xmlns:w15="http://schemas.microsoft.com/office/word/2012/wordml" xmlns:w16cei="http://schemas.microsoft.com/office/word/2026/wordml/cei" xmlns:w16cex="http://schemas.microsoft.com/office/word/2018/wordml/cex" xmlns:w16cid="http://schemas.microsoft.com/office/word/2016/wordml/cid" xmlns:w16="http://schemas.microsoft.com/office/word/2018/wordml" xmlns:w16sdtdh="http://schemas.microsoft.com/office/word/2020/wordml/sdtdatahash" xmlns:w16sdtfl="http://schemas.microsoft.com/office/word/2024/wordml/sdtformatlock" xmlns:w16se="http://schemas.microsoft.com/office/word/2015/wordml/symex" xmlns:w16du="http://schemas.microsoft.com/office/word/2023/wordml/word16du" xmlns:wne="http://schemas.microsoft.com/office/word/2006/wordml" mc:Ignorable="w14 w15 w16se w16cid w16 w16cex w16sdtdh w16sdtfl w16du wp14">
+<w:endnotes xmlns:wpc="http://schemas.microsoft.com/office/word/2010/wordprocessingCanvas" xmlns:cx="http://schemas.microsoft.com/office/drawing/2014/chartex" xmlns:cx1="http://schemas.microsoft.com/office/drawing/2015/9/8/chartex" xmlns:cx2="http://schemas.microsoft.com/office/drawing/2015/10/21/chartex" xmlns:cx3="http://schemas.microsoft.com/office/drawing/2016/5/9/chartex" xmlns:cx4="http://schemas.microsoft.com/office/drawing/2016/5/10/chartex" xmlns:cx5="http://schemas.microsoft.com/office/drawing/2016/5/11/chartex" xmlns:cx6="http://schemas.microsoft.com/office/drawing/2016/5/12/chartex" xmlns:cx7="http://schemas.microsoft.com/office/drawing/2016/5/13/chartex" xmlns:cx8="http://schemas.microsoft.com/office/drawing/2016/5/14/chartex" xmlns:mc="http://schemas.openxmlformats.org/markup-compatibility/2006" xmlns:aink="http://schemas.microsoft.com/office/drawing/2016/ink" xmlns:am3d="http://schemas.microsoft.com/office/drawing/2017/model3d" xmlns:o="urn:schemas-microsoft-com:office:office" xmlns:r="http://schemas.openxmlformats.org/officeDocument/2006/relationships" xmlns:m="http://schemas.openxmlformats.org/officeDocument/2006/math" xmlns:v="urn:schemas-microsoft-com:vml" xmlns:wp14="http://schemas.microsoft.com/office/word/2010/wordprocessingDrawing" xmlns:wp="http://schemas.openxmlformats.org/drawingml/2006/wordprocessingDrawing" xmlns:w10="urn:schemas-microsoft-com:office:word" xmlns:w="http://schemas.openxmlformats.org/wordprocessingml/2006/main" xmlns:w14="http://schemas.microsoft.com/office/word/2010/wordml" xmlns:w15="http://schemas.microsoft.com/office/word/2012/wordml" xmlns:w16cid="http://schemas.microsoft.com/office/word/2016/wordml/cid" xmlns:w16se="http://schemas.microsoft.com/office/word/2015/wordml/symex" xmlns:wpg="http://schemas.microsoft.com/office/word/2010/wordprocessingGroup" xmlns:wpi="http://schemas.microsoft.com/office/word/2010/wordprocessingInk" xmlns:wne="http://schemas.microsoft.com/office/word/2006/wordml" xmlns:wps="http://schemas.microsoft.com/office/word/2010/wordprocessingShape" mc:Ignorable="w14 w15 w16se w16cid wp14">
   <w:endnote w:type="separator" w:id="-1">
     <w:p>
       <w:pPr>
@@ -1177,7 +1338,7 @@
 </file>
 
 <file path=word/footer1.xml><?xml version="1.0" encoding="utf-8"?>
-<w:ftr xmlns:wpc="http://schemas.microsoft.com/office/word/2010/wordprocessingCanvas" xmlns:cx="http://schemas.microsoft.com/office/drawing/2014/chartex" xmlns:cx1="http://schemas.microsoft.com/office/drawing/2015/9/8/chartex" xmlns:cx2="http://schemas.microsoft.com/office/drawing/2015/10/21/chartex" xmlns:cx3="http://schemas.microsoft.com/office/drawing/2016/5/9/chartex" xmlns:cx4="http://schemas.microsoft.com/office/drawing/2016/5/10/chartex" xmlns:cx5="http://schemas.microsoft.com/office/drawing/2016/5/11/chartex" xmlns:cx6="http://schemas.microsoft.com/office/drawing/2016/5/12/chartex" xmlns:cx7="http://schemas.microsoft.com/office/drawing/2016/5/13/chartex" xmlns:cx8="http://schemas.microsoft.com/office/drawing/2016/5/14/chartex" xmlns:mc="http://schemas.openxmlformats.org/markup-compatibility/2006" xmlns:m="http://schemas.openxmlformats.org/officeDocument/2006/math" xmlns:aink="http://schemas.microsoft.com/office/drawing/2016/ink" xmlns:am3d="http://schemas.microsoft.com/office/drawing/2017/model3d" xmlns:oel="http://schemas.microsoft.com/office/2019/extlst" xmlns:r="http://schemas.openxmlformats.org/officeDocument/2006/relationships" xmlns:wp14="http://schemas.microsoft.com/office/word/2010/wordprocessingDrawing" xmlns:wp="http://schemas.openxmlformats.org/drawingml/2006/wordprocessingDrawing" xmlns:wpg="http://schemas.microsoft.com/office/word/2010/wordprocessingGroup" xmlns:wpi="http://schemas.microsoft.com/office/word/2010/wordprocessingInk" xmlns:wps="http://schemas.microsoft.com/office/word/2010/wordprocessingShape" xmlns:o="urn:schemas-microsoft-com:office:office" xmlns:v="urn:schemas-microsoft-com:vml" xmlns:w10="urn:schemas-microsoft-com:office:word" xmlns:w="http://schemas.openxmlformats.org/wordprocessingml/2006/main" xmlns:w14="http://schemas.microsoft.com/office/word/2010/wordml" xmlns:w15="http://schemas.microsoft.com/office/word/2012/wordml" xmlns:w16cei="http://schemas.microsoft.com/office/word/2026/wordml/cei" xmlns:w16cex="http://schemas.microsoft.com/office/word/2018/wordml/cex" xmlns:w16cid="http://schemas.microsoft.com/office/word/2016/wordml/cid" xmlns:w16="http://schemas.microsoft.com/office/word/2018/wordml" xmlns:w16sdtdh="http://schemas.microsoft.com/office/word/2020/wordml/sdtdatahash" xmlns:w16sdtfl="http://schemas.microsoft.com/office/word/2024/wordml/sdtformatlock" xmlns:w16se="http://schemas.microsoft.com/office/word/2015/wordml/symex" xmlns:w16du="http://schemas.microsoft.com/office/word/2023/wordml/word16du" xmlns:wne="http://schemas.microsoft.com/office/word/2006/wordml" mc:Ignorable="w14 w15 w16se w16cid w16 w16cex w16sdtdh w16sdtfl w16du wp14">
+<w:ftr xmlns:wpc="http://schemas.microsoft.com/office/word/2010/wordprocessingCanvas" xmlns:cx="http://schemas.microsoft.com/office/drawing/2014/chartex" xmlns:cx1="http://schemas.microsoft.com/office/drawing/2015/9/8/chartex" xmlns:cx2="http://schemas.microsoft.com/office/drawing/2015/10/21/chartex" xmlns:cx3="http://schemas.microsoft.com/office/drawing/2016/5/9/chartex" xmlns:cx4="http://schemas.microsoft.com/office/drawing/2016/5/10/chartex" xmlns:cx5="http://schemas.microsoft.com/office/drawing/2016/5/11/chartex" xmlns:cx6="http://schemas.microsoft.com/office/drawing/2016/5/12/chartex" xmlns:cx7="http://schemas.microsoft.com/office/drawing/2016/5/13/chartex" xmlns:cx8="http://schemas.microsoft.com/office/drawing/2016/5/14/chartex" xmlns:mc="http://schemas.openxmlformats.org/markup-compatibility/2006" xmlns:aink="http://schemas.microsoft.com/office/drawing/2016/ink" xmlns:am3d="http://schemas.microsoft.com/office/drawing/2017/model3d" xmlns:o="urn:schemas-microsoft-com:office:office" xmlns:r="http://schemas.openxmlformats.org/officeDocument/2006/relationships" xmlns:m="http://schemas.openxmlformats.org/officeDocument/2006/math" xmlns:v="urn:schemas-microsoft-com:vml" xmlns:wp14="http://schemas.microsoft.com/office/word/2010/wordprocessingDrawing" xmlns:wp="http://schemas.openxmlformats.org/drawingml/2006/wordprocessingDrawing" xmlns:w10="urn:schemas-microsoft-com:office:word" xmlns:w="http://schemas.openxmlformats.org/wordprocessingml/2006/main" xmlns:w14="http://schemas.microsoft.com/office/word/2010/wordml" xmlns:w15="http://schemas.microsoft.com/office/word/2012/wordml" xmlns:w16cid="http://schemas.microsoft.com/office/word/2016/wordml/cid" xmlns:w16se="http://schemas.microsoft.com/office/word/2015/wordml/symex" xmlns:wpg="http://schemas.microsoft.com/office/word/2010/wordprocessingGroup" xmlns:wpi="http://schemas.microsoft.com/office/word/2010/wordprocessingInk" xmlns:wne="http://schemas.microsoft.com/office/word/2006/wordml" xmlns:wps="http://schemas.microsoft.com/office/word/2010/wordprocessingShape" mc:Ignorable="w14 w15 w16se w16cid wp14">
   <w:p>
     <w:pPr>
       <w:pStyle w:val="Footer"/>
@@ -1187,7 +1348,7 @@
 </file>
 
 <file path=word/footer2.xml><?xml version="1.0" encoding="utf-8"?>
-<w:ftr xmlns:wpc="http://schemas.microsoft.com/office/word/2010/wordprocessingCanvas" xmlns:cx="http://schemas.microsoft.com/office/drawing/2014/chartex" xmlns:cx1="http://schemas.microsoft.com/office/drawing/2015/9/8/chartex" xmlns:cx2="http://schemas.microsoft.com/office/drawing/2015/10/21/chartex" xmlns:cx3="http://schemas.microsoft.com/office/drawing/2016/5/9/chartex" xmlns:cx4="http://schemas.microsoft.com/office/drawing/2016/5/10/chartex" xmlns:cx5="http://schemas.microsoft.com/office/drawing/2016/5/11/chartex" xmlns:cx6="http://schemas.microsoft.com/office/drawing/2016/5/12/chartex" xmlns:cx7="http://schemas.microsoft.com/office/drawing/2016/5/13/chartex" xmlns:cx8="http://schemas.microsoft.com/office/drawing/2016/5/14/chartex" xmlns:mc="http://schemas.openxmlformats.org/markup-compatibility/2006" xmlns:m="http://schemas.openxmlformats.org/officeDocument/2006/math" xmlns:aink="http://schemas.microsoft.com/office/drawing/2016/ink" xmlns:am3d="http://schemas.microsoft.com/office/drawing/2017/model3d" xmlns:oel="http://schemas.microsoft.com/office/2019/extlst" xmlns:r="http://schemas.openxmlformats.org/officeDocument/2006/relationships" xmlns:wp14="http://schemas.microsoft.com/office/word/2010/wordprocessingDrawing" xmlns:wp="http://schemas.openxmlformats.org/drawingml/2006/wordprocessingDrawing" xmlns:wpg="http://schemas.microsoft.com/office/word/2010/wordprocessingGroup" xmlns:wpi="http://schemas.microsoft.com/office/word/2010/wordprocessingInk" xmlns:wps="http://schemas.microsoft.com/office/word/2010/wordprocessingShape" xmlns:o="urn:schemas-microsoft-com:office:office" xmlns:v="urn:schemas-microsoft-com:vml" xmlns:w10="urn:schemas-microsoft-com:office:word" xmlns:w="http://schemas.openxmlformats.org/wordprocessingml/2006/main" xmlns:w14="http://schemas.microsoft.com/office/word/2010/wordml" xmlns:w15="http://schemas.microsoft.com/office/word/2012/wordml" xmlns:w16cei="http://schemas.microsoft.com/office/word/2026/wordml/cei" xmlns:w16cex="http://schemas.microsoft.com/office/word/2018/wordml/cex" xmlns:w16cid="http://schemas.microsoft.com/office/word/2016/wordml/cid" xmlns:w16="http://schemas.microsoft.com/office/word/2018/wordml" xmlns:w16sdtdh="http://schemas.microsoft.com/office/word/2020/wordml/sdtdatahash" xmlns:w16sdtfl="http://schemas.microsoft.com/office/word/2024/wordml/sdtformatlock" xmlns:w16se="http://schemas.microsoft.com/office/word/2015/wordml/symex" xmlns:w16du="http://schemas.microsoft.com/office/word/2023/wordml/word16du" xmlns:wne="http://schemas.microsoft.com/office/word/2006/wordml" mc:Ignorable="w14 w15 w16se w16cid w16 w16cex w16sdtdh w16sdtfl w16du wp14">
+<w:ftr xmlns:wpc="http://schemas.microsoft.com/office/word/2010/wordprocessingCanvas" xmlns:cx="http://schemas.microsoft.com/office/drawing/2014/chartex" xmlns:cx1="http://schemas.microsoft.com/office/drawing/2015/9/8/chartex" xmlns:cx2="http://schemas.microsoft.com/office/drawing/2015/10/21/chartex" xmlns:cx3="http://schemas.microsoft.com/office/drawing/2016/5/9/chartex" xmlns:cx4="http://schemas.microsoft.com/office/drawing/2016/5/10/chartex" xmlns:cx5="http://schemas.microsoft.com/office/drawing/2016/5/11/chartex" xmlns:cx6="http://schemas.microsoft.com/office/drawing/2016/5/12/chartex" xmlns:cx7="http://schemas.microsoft.com/office/drawing/2016/5/13/chartex" xmlns:cx8="http://schemas.microsoft.com/office/drawing/2016/5/14/chartex" xmlns:mc="http://schemas.openxmlformats.org/markup-compatibility/2006" xmlns:aink="http://schemas.microsoft.com/office/drawing/2016/ink" xmlns:am3d="http://schemas.microsoft.com/office/drawing/2017/model3d" xmlns:o="urn:schemas-microsoft-com:office:office" xmlns:r="http://schemas.openxmlformats.org/officeDocument/2006/relationships" xmlns:m="http://schemas.openxmlformats.org/officeDocument/2006/math" xmlns:v="urn:schemas-microsoft-com:vml" xmlns:wp14="http://schemas.microsoft.com/office/word/2010/wordprocessingDrawing" xmlns:wp="http://schemas.openxmlformats.org/drawingml/2006/wordprocessingDrawing" xmlns:w10="urn:schemas-microsoft-com:office:word" xmlns:w="http://schemas.openxmlformats.org/wordprocessingml/2006/main" xmlns:w14="http://schemas.microsoft.com/office/word/2010/wordml" xmlns:w15="http://schemas.microsoft.com/office/word/2012/wordml" xmlns:w16cid="http://schemas.microsoft.com/office/word/2016/wordml/cid" xmlns:w16se="http://schemas.microsoft.com/office/word/2015/wordml/symex" xmlns:wpg="http://schemas.microsoft.com/office/word/2010/wordprocessingGroup" xmlns:wpi="http://schemas.microsoft.com/office/word/2010/wordprocessingInk" xmlns:wne="http://schemas.microsoft.com/office/word/2006/wordml" xmlns:wps="http://schemas.microsoft.com/office/word/2010/wordprocessingShape" mc:Ignorable="w14 w15 w16se w16cid wp14">
   <w:p>
     <w:pPr>
       <w:pStyle w:val="Footer"/>
@@ -1197,7 +1358,7 @@
 </file>
 
 <file path=word/footer3.xml><?xml version="1.0" encoding="utf-8"?>
-<w:ftr xmlns:wpc="http://schemas.microsoft.com/office/word/2010/wordprocessingCanvas" xmlns:cx="http://schemas.microsoft.com/office/drawing/2014/chartex" xmlns:cx1="http://schemas.microsoft.com/office/drawing/2015/9/8/chartex" xmlns:cx2="http://schemas.microsoft.com/office/drawing/2015/10/21/chartex" xmlns:cx3="http://schemas.microsoft.com/office/drawing/2016/5/9/chartex" xmlns:cx4="http://schemas.microsoft.com/office/drawing/2016/5/10/chartex" xmlns:cx5="http://schemas.microsoft.com/office/drawing/2016/5/11/chartex" xmlns:cx6="http://schemas.microsoft.com/office/drawing/2016/5/12/chartex" xmlns:cx7="http://schemas.microsoft.com/office/drawing/2016/5/13/chartex" xmlns:cx8="http://schemas.microsoft.com/office/drawing/2016/5/14/chartex" xmlns:mc="http://schemas.openxmlformats.org/markup-compatibility/2006" xmlns:m="http://schemas.openxmlformats.org/officeDocument/2006/math" xmlns:aink="http://schemas.microsoft.com/office/drawing/2016/ink" xmlns:am3d="http://schemas.microsoft.com/office/drawing/2017/model3d" xmlns:oel="http://schemas.microsoft.com/office/2019/extlst" xmlns:r="http://schemas.openxmlformats.org/officeDocument/2006/relationships" xmlns:wp14="http://schemas.microsoft.com/office/word/2010/wordprocessingDrawing" xmlns:wp="http://schemas.openxmlformats.org/drawingml/2006/wordprocessingDrawing" xmlns:wpg="http://schemas.microsoft.com/office/word/2010/wordprocessingGroup" xmlns:wpi="http://schemas.microsoft.com/office/word/2010/wordprocessingInk" xmlns:wps="http://schemas.microsoft.com/office/word/2010/wordprocessingShape" xmlns:o="urn:schemas-microsoft-com:office:office" xmlns:v="urn:schemas-microsoft-com:vml" xmlns:w10="urn:schemas-microsoft-com:office:word" xmlns:w="http://schemas.openxmlformats.org/wordprocessingml/2006/main" xmlns:w14="http://schemas.microsoft.com/office/word/2010/wordml" xmlns:w15="http://schemas.microsoft.com/office/word/2012/wordml" xmlns:w16cei="http://schemas.microsoft.com/office/word/2026/wordml/cei" xmlns:w16cex="http://schemas.microsoft.com/office/word/2018/wordml/cex" xmlns:w16cid="http://schemas.microsoft.com/office/word/2016/wordml/cid" xmlns:w16="http://schemas.microsoft.com/office/word/2018/wordml" xmlns:w16sdtdh="http://schemas.microsoft.com/office/word/2020/wordml/sdtdatahash" xmlns:w16sdtfl="http://schemas.microsoft.com/office/word/2024/wordml/sdtformatlock" xmlns:w16se="http://schemas.microsoft.com/office/word/2015/wordml/symex" xmlns:w16du="http://schemas.microsoft.com/office/word/2023/wordml/word16du" xmlns:wne="http://schemas.microsoft.com/office/word/2006/wordml" mc:Ignorable="w14 w15 w16se w16cid w16 w16cex w16sdtdh w16sdtfl w16du wp14">
+<w:ftr xmlns:wpc="http://schemas.microsoft.com/office/word/2010/wordprocessingCanvas" xmlns:cx="http://schemas.microsoft.com/office/drawing/2014/chartex" xmlns:cx1="http://schemas.microsoft.com/office/drawing/2015/9/8/chartex" xmlns:cx2="http://schemas.microsoft.com/office/drawing/2015/10/21/chartex" xmlns:cx3="http://schemas.microsoft.com/office/drawing/2016/5/9/chartex" xmlns:cx4="http://schemas.microsoft.com/office/drawing/2016/5/10/chartex" xmlns:cx5="http://schemas.microsoft.com/office/drawing/2016/5/11/chartex" xmlns:cx6="http://schemas.microsoft.com/office/drawing/2016/5/12/chartex" xmlns:cx7="http://schemas.microsoft.com/office/drawing/2016/5/13/chartex" xmlns:cx8="http://schemas.microsoft.com/office/drawing/2016/5/14/chartex" xmlns:mc="http://schemas.openxmlformats.org/markup-compatibility/2006" xmlns:aink="http://schemas.microsoft.com/office/drawing/2016/ink" xmlns:am3d="http://schemas.microsoft.com/office/drawing/2017/model3d" xmlns:o="urn:schemas-microsoft-com:office:office" xmlns:r="http://schemas.openxmlformats.org/officeDocument/2006/relationships" xmlns:m="http://schemas.openxmlformats.org/officeDocument/2006/math" xmlns:v="urn:schemas-microsoft-com:vml" xmlns:wp14="http://schemas.microsoft.com/office/word/2010/wordprocessingDrawing" xmlns:wp="http://schemas.openxmlformats.org/drawingml/2006/wordprocessingDrawing" xmlns:w10="urn:schemas-microsoft-com:office:word" xmlns:w="http://schemas.openxmlformats.org/wordprocessingml/2006/main" xmlns:w14="http://schemas.microsoft.com/office/word/2010/wordml" xmlns:w15="http://schemas.microsoft.com/office/word/2012/wordml" xmlns:w16cid="http://schemas.microsoft.com/office/word/2016/wordml/cid" xmlns:w16se="http://schemas.microsoft.com/office/word/2015/wordml/symex" xmlns:wpg="http://schemas.microsoft.com/office/word/2010/wordprocessingGroup" xmlns:wpi="http://schemas.microsoft.com/office/word/2010/wordprocessingInk" xmlns:wne="http://schemas.microsoft.com/office/word/2006/wordml" xmlns:wps="http://schemas.microsoft.com/office/word/2010/wordprocessingShape" mc:Ignorable="w14 w15 w16se w16cid wp14">
   <w:p>
     <w:pPr>
       <w:pStyle w:val="Footer"/>
@@ -1207,7 +1368,7 @@
 </file>
 
 <file path=word/footnotes.xml><?xml version="1.0" encoding="utf-8"?>
-<w:footnotes xmlns:wpc="http://schemas.microsoft.com/office/word/2010/wordprocessingCanvas" xmlns:cx="http://schemas.microsoft.com/office/drawing/2014/chartex" xmlns:cx1="http://schemas.microsoft.com/office/drawing/2015/9/8/chartex" xmlns:cx2="http://schemas.microsoft.com/office/drawing/2015/10/21/chartex" xmlns:cx3="http://schemas.microsoft.com/office/drawing/2016/5/9/chartex" xmlns:cx4="http://schemas.microsoft.com/office/drawing/2016/5/10/chartex" xmlns:cx5="http://schemas.microsoft.com/office/drawing/2016/5/11/chartex" xmlns:cx6="http://schemas.microsoft.com/office/drawing/2016/5/12/chartex" xmlns:cx7="http://schemas.microsoft.com/office/drawing/2016/5/13/chartex" xmlns:cx8="http://schemas.microsoft.com/office/drawing/2016/5/14/chartex" xmlns:mc="http://schemas.openxmlformats.org/markup-compatibility/2006" xmlns:m="http://schemas.openxmlformats.org/officeDocument/2006/math" xmlns:aink="http://schemas.microsoft.com/office/drawing/2016/ink" xmlns:am3d="http://schemas.microsoft.com/office/drawing/2017/model3d" xmlns:oel="http://schemas.microsoft.com/office/2019/extlst" xmlns:r="http://schemas.openxmlformats.org/officeDocument/2006/relationships" xmlns:wp14="http://schemas.microsoft.com/office/word/2010/wordprocessingDrawing" xmlns:wp="http://schemas.openxmlformats.org/drawingml/2006/wordprocessingDrawing" xmlns:wpg="http://schemas.microsoft.com/office/word/2010/wordprocessingGroup" xmlns:wpi="http://schemas.microsoft.com/office/word/2010/wordprocessingInk" xmlns:wps="http://schemas.microsoft.com/office/word/2010/wordprocessingShape" xmlns:o="urn:schemas-microsoft-com:office:office" xmlns:v="urn:schemas-microsoft-com:vml" xmlns:w10="urn:schemas-microsoft-com:office:word" xmlns:w="http://schemas.openxmlformats.org/wordprocessingml/2006/main" xmlns:w14="http://schemas.microsoft.com/office/word/2010/wordml" xmlns:w15="http://schemas.microsoft.com/office/word/2012/wordml" xmlns:w16cei="http://schemas.microsoft.com/office/word/2026/wordml/cei" xmlns:w16cex="http://schemas.microsoft.com/office/word/2018/wordml/cex" xmlns:w16cid="http://schemas.microsoft.com/office/word/2016/wordml/cid" xmlns:w16="http://schemas.microsoft.com/office/word/2018/wordml" xmlns:w16sdtdh="http://schemas.microsoft.com/office/word/2020/wordml/sdtdatahash" xmlns:w16sdtfl="http://schemas.microsoft.com/office/word/2024/wordml/sdtformatlock" xmlns:w16se="http://schemas.microsoft.com/office/word/2015/wordml/symex" xmlns:w16du="http://schemas.microsoft.com/office/word/2023/wordml/word16du" xmlns:wne="http://schemas.microsoft.com/office/word/2006/wordml" mc:Ignorable="w14 w15 w16se w16cid w16 w16cex w16sdtdh w16sdtfl w16du wp14">
+<w:footnotes xmlns:wpc="http://schemas.microsoft.com/office/word/2010/wordprocessingCanvas" xmlns:cx="http://schemas.microsoft.com/office/drawing/2014/chartex" xmlns:cx1="http://schemas.microsoft.com/office/drawing/2015/9/8/chartex" xmlns:cx2="http://schemas.microsoft.com/office/drawing/2015/10/21/chartex" xmlns:cx3="http://schemas.microsoft.com/office/drawing/2016/5/9/chartex" xmlns:cx4="http://schemas.microsoft.com/office/drawing/2016/5/10/chartex" xmlns:cx5="http://schemas.microsoft.com/office/drawing/2016/5/11/chartex" xmlns:cx6="http://schemas.microsoft.com/office/drawing/2016/5/12/chartex" xmlns:cx7="http://schemas.microsoft.com/office/drawing/2016/5/13/chartex" xmlns:cx8="http://schemas.microsoft.com/office/drawing/2016/5/14/chartex" xmlns:mc="http://schemas.openxmlformats.org/markup-compatibility/2006" xmlns:aink="http://schemas.microsoft.com/office/drawing/2016/ink" xmlns:am3d="http://schemas.microsoft.com/office/drawing/2017/model3d" xmlns:o="urn:schemas-microsoft-com:office:office" xmlns:r="http://schemas.openxmlformats.org/officeDocument/2006/relationships" xmlns:m="http://schemas.openxmlformats.org/officeDocument/2006/math" xmlns:v="urn:schemas-microsoft-com:vml" xmlns:wp14="http://schemas.microsoft.com/office/word/2010/wordprocessingDrawing" xmlns:wp="http://schemas.openxmlformats.org/drawingml/2006/wordprocessingDrawing" xmlns:w10="urn:schemas-microsoft-com:office:word" xmlns:w="http://schemas.openxmlformats.org/wordprocessingml/2006/main" xmlns:w14="http://schemas.microsoft.com/office/word/2010/wordml" xmlns:w15="http://schemas.microsoft.com/office/word/2012/wordml" xmlns:w16cid="http://schemas.microsoft.com/office/word/2016/wordml/cid" xmlns:w16se="http://schemas.microsoft.com/office/word/2015/wordml/symex" xmlns:wpg="http://schemas.microsoft.com/office/word/2010/wordprocessingGroup" xmlns:wpi="http://schemas.microsoft.com/office/word/2010/wordprocessingInk" xmlns:wne="http://schemas.microsoft.com/office/word/2006/wordml" xmlns:wps="http://schemas.microsoft.com/office/word/2010/wordprocessingShape" mc:Ignorable="w14 w15 w16se w16cid wp14">
   <w:footnote w:type="separator" w:id="-1">
     <w:p>
       <w:pPr>
@@ -1232,7 +1393,7 @@
 </file>
 
 <file path=word/header1.xml><?xml version="1.0" encoding="utf-8"?>
-<w:hdr xmlns:wpc="http://schemas.microsoft.com/office/word/2010/wordprocessingCanvas" xmlns:cx="http://schemas.microsoft.com/office/drawing/2014/chartex" xmlns:cx1="http://schemas.microsoft.com/office/drawing/2015/9/8/chartex" xmlns:cx2="http://schemas.microsoft.com/office/drawing/2015/10/21/chartex" xmlns:cx3="http://schemas.microsoft.com/office/drawing/2016/5/9/chartex" xmlns:cx4="http://schemas.microsoft.com/office/drawing/2016/5/10/chartex" xmlns:cx5="http://schemas.microsoft.com/office/drawing/2016/5/11/chartex" xmlns:cx6="http://schemas.microsoft.com/office/drawing/2016/5/12/chartex" xmlns:cx7="http://schemas.microsoft.com/office/drawing/2016/5/13/chartex" xmlns:cx8="http://schemas.microsoft.com/office/drawing/2016/5/14/chartex" xmlns:mc="http://schemas.openxmlformats.org/markup-compatibility/2006" xmlns:m="http://schemas.openxmlformats.org/officeDocument/2006/math" xmlns:aink="http://schemas.microsoft.com/office/drawing/2016/ink" xmlns:am3d="http://schemas.microsoft.com/office/drawing/2017/model3d" xmlns:oel="http://schemas.microsoft.com/office/2019/extlst" xmlns:r="http://schemas.openxmlformats.org/officeDocument/2006/relationships" xmlns:wp14="http://schemas.microsoft.com/office/word/2010/wordprocessingDrawing" xmlns:wp="http://schemas.openxmlformats.org/drawingml/2006/wordprocessingDrawing" xmlns:wpg="http://schemas.microsoft.com/office/word/2010/wordprocessingGroup" xmlns:wpi="http://schemas.microsoft.com/office/word/2010/wordprocessingInk" xmlns:wps="http://schemas.microsoft.com/office/word/2010/wordprocessingShape" xmlns:o="urn:schemas-microsoft-com:office:office" xmlns:v="urn:schemas-microsoft-com:vml" xmlns:w10="urn:schemas-microsoft-com:office:word" xmlns:w="http://schemas.openxmlformats.org/wordprocessingml/2006/main" xmlns:w14="http://schemas.microsoft.com/office/word/2010/wordml" xmlns:w15="http://schemas.microsoft.com/office/word/2012/wordml" xmlns:w16cei="http://schemas.microsoft.com/office/word/2026/wordml/cei" xmlns:w16cex="http://schemas.microsoft.com/office/word/2018/wordml/cex" xmlns:w16cid="http://schemas.microsoft.com/office/word/2016/wordml/cid" xmlns:w16="http://schemas.microsoft.com/office/word/2018/wordml" xmlns:w16sdtdh="http://schemas.microsoft.com/office/word/2020/wordml/sdtdatahash" xmlns:w16sdtfl="http://schemas.microsoft.com/office/word/2024/wordml/sdtformatlock" xmlns:w16se="http://schemas.microsoft.com/office/word/2015/wordml/symex" xmlns:w16du="http://schemas.microsoft.com/office/word/2023/wordml/word16du" xmlns:wne="http://schemas.microsoft.com/office/word/2006/wordml" mc:Ignorable="w14 w15 w16se w16cid w16 w16cex w16sdtdh w16sdtfl w16du wp14">
+<w:hdr xmlns:wpc="http://schemas.microsoft.com/office/word/2010/wordprocessingCanvas" xmlns:cx="http://schemas.microsoft.com/office/drawing/2014/chartex" xmlns:cx1="http://schemas.microsoft.com/office/drawing/2015/9/8/chartex" xmlns:cx2="http://schemas.microsoft.com/office/drawing/2015/10/21/chartex" xmlns:cx3="http://schemas.microsoft.com/office/drawing/2016/5/9/chartex" xmlns:cx4="http://schemas.microsoft.com/office/drawing/2016/5/10/chartex" xmlns:cx5="http://schemas.microsoft.com/office/drawing/2016/5/11/chartex" xmlns:cx6="http://schemas.microsoft.com/office/drawing/2016/5/12/chartex" xmlns:cx7="http://schemas.microsoft.com/office/drawing/2016/5/13/chartex" xmlns:cx8="http://schemas.microsoft.com/office/drawing/2016/5/14/chartex" xmlns:mc="http://schemas.openxmlformats.org/markup-compatibility/2006" xmlns:aink="http://schemas.microsoft.com/office/drawing/2016/ink" xmlns:am3d="http://schemas.microsoft.com/office/drawing/2017/model3d" xmlns:o="urn:schemas-microsoft-com:office:office" xmlns:r="http://schemas.openxmlformats.org/officeDocument/2006/relationships" xmlns:m="http://schemas.openxmlformats.org/officeDocument/2006/math" xmlns:v="urn:schemas-microsoft-com:vml" xmlns:wp14="http://schemas.microsoft.com/office/word/2010/wordprocessingDrawing" xmlns:wp="http://schemas.openxmlformats.org/drawingml/2006/wordprocessingDrawing" xmlns:w10="urn:schemas-microsoft-com:office:word" xmlns:w="http://schemas.openxmlformats.org/wordprocessingml/2006/main" xmlns:w14="http://schemas.microsoft.com/office/word/2010/wordml" xmlns:w15="http://schemas.microsoft.com/office/word/2012/wordml" xmlns:w16cid="http://schemas.microsoft.com/office/word/2016/wordml/cid" xmlns:w16se="http://schemas.microsoft.com/office/word/2015/wordml/symex" xmlns:wpg="http://schemas.microsoft.com/office/word/2010/wordprocessingGroup" xmlns:wpi="http://schemas.microsoft.com/office/word/2010/wordprocessingInk" xmlns:wne="http://schemas.microsoft.com/office/word/2006/wordml" xmlns:wps="http://schemas.microsoft.com/office/word/2010/wordprocessingShape" mc:Ignorable="w14 w15 w16se w16cid wp14">
   <w:p>
     <w:pPr>
       <w:pStyle w:val="Header"/>
@@ -1242,7 +1403,7 @@
 </file>
 
 <file path=word/header2.xml><?xml version="1.0" encoding="utf-8"?>
-<w:hdr xmlns:wpc="http://schemas.microsoft.com/office/word/2010/wordprocessingCanvas" xmlns:cx="http://schemas.microsoft.com/office/drawing/2014/chartex" xmlns:cx1="http://schemas.microsoft.com/office/drawing/2015/9/8/chartex" xmlns:cx2="http://schemas.microsoft.com/office/drawing/2015/10/21/chartex" xmlns:cx3="http://schemas.microsoft.com/office/drawing/2016/5/9/chartex" xmlns:cx4="http://schemas.microsoft.com/office/drawing/2016/5/10/chartex" xmlns:cx5="http://schemas.microsoft.com/office/drawing/2016/5/11/chartex" xmlns:cx6="http://schemas.microsoft.com/office/drawing/2016/5/12/chartex" xmlns:cx7="http://schemas.microsoft.com/office/drawing/2016/5/13/chartex" xmlns:cx8="http://schemas.microsoft.com/office/drawing/2016/5/14/chartex" xmlns:mc="http://schemas.openxmlformats.org/markup-compatibility/2006" xmlns:m="http://schemas.openxmlformats.org/officeDocument/2006/math" xmlns:aink="http://schemas.microsoft.com/office/drawing/2016/ink" xmlns:am3d="http://schemas.microsoft.com/office/drawing/2017/model3d" xmlns:oel="http://schemas.microsoft.com/office/2019/extlst" xmlns:r="http://schemas.openxmlformats.org/officeDocument/2006/relationships" xmlns:wp14="http://schemas.microsoft.com/office/word/2010/wordprocessingDrawing" xmlns:wp="http://schemas.openxmlformats.org/drawingml/2006/wordprocessingDrawing" xmlns:wpg="http://schemas.microsoft.com/office/word/2010/wordprocessingGroup" xmlns:wpi="http://schemas.microsoft.com/office/word/2010/wordprocessingInk" xmlns:wps="http://schemas.microsoft.com/office/word/2010/wordprocessingShape" xmlns:o="urn:schemas-microsoft-com:office:office" xmlns:v="urn:schemas-microsoft-com:vml" xmlns:w10="urn:schemas-microsoft-com:office:word" xmlns:w="http://schemas.openxmlformats.org/wordprocessingml/2006/main" xmlns:w14="http://schemas.microsoft.com/office/word/2010/wordml" xmlns:w15="http://schemas.microsoft.com/office/word/2012/wordml" xmlns:w16cei="http://schemas.microsoft.com/office/word/2026/wordml/cei" xmlns:w16cex="http://schemas.microsoft.com/office/word/2018/wordml/cex" xmlns:w16cid="http://schemas.microsoft.com/office/word/2016/wordml/cid" xmlns:w16="http://schemas.microsoft.com/office/word/2018/wordml" xmlns:w16sdtdh="http://schemas.microsoft.com/office/word/2020/wordml/sdtdatahash" xmlns:w16sdtfl="http://schemas.microsoft.com/office/word/2024/wordml/sdtformatlock" xmlns:w16se="http://schemas.microsoft.com/office/word/2015/wordml/symex" xmlns:w16du="http://schemas.microsoft.com/office/word/2023/wordml/word16du" xmlns:wne="http://schemas.microsoft.com/office/word/2006/wordml" mc:Ignorable="w14 w15 w16se w16cid w16 w16cex w16sdtdh w16sdtfl w16du wp14">
+<w:hdr xmlns:wpc="http://schemas.microsoft.com/office/word/2010/wordprocessingCanvas" xmlns:cx="http://schemas.microsoft.com/office/drawing/2014/chartex" xmlns:cx1="http://schemas.microsoft.com/office/drawing/2015/9/8/chartex" xmlns:cx2="http://schemas.microsoft.com/office/drawing/2015/10/21/chartex" xmlns:cx3="http://schemas.microsoft.com/office/drawing/2016/5/9/chartex" xmlns:cx4="http://schemas.microsoft.com/office/drawing/2016/5/10/chartex" xmlns:cx5="http://schemas.microsoft.com/office/drawing/2016/5/11/chartex" xmlns:cx6="http://schemas.microsoft.com/office/drawing/2016/5/12/chartex" xmlns:cx7="http://schemas.microsoft.com/office/drawing/2016/5/13/chartex" xmlns:cx8="http://schemas.microsoft.com/office/drawing/2016/5/14/chartex" xmlns:mc="http://schemas.openxmlformats.org/markup-compatibility/2006" xmlns:aink="http://schemas.microsoft.com/office/drawing/2016/ink" xmlns:am3d="http://schemas.microsoft.com/office/drawing/2017/model3d" xmlns:o="urn:schemas-microsoft-com:office:office" xmlns:r="http://schemas.openxmlformats.org/officeDocument/2006/relationships" xmlns:m="http://schemas.openxmlformats.org/officeDocument/2006/math" xmlns:v="urn:schemas-microsoft-com:vml" xmlns:wp14="http://schemas.microsoft.com/office/word/2010/wordprocessingDrawing" xmlns:wp="http://schemas.openxmlformats.org/drawingml/2006/wordprocessingDrawing" xmlns:w10="urn:schemas-microsoft-com:office:word" xmlns:w="http://schemas.openxmlformats.org/wordprocessingml/2006/main" xmlns:w14="http://schemas.microsoft.com/office/word/2010/wordml" xmlns:w15="http://schemas.microsoft.com/office/word/2012/wordml" xmlns:w16cid="http://schemas.microsoft.com/office/word/2016/wordml/cid" xmlns:w16se="http://schemas.microsoft.com/office/word/2015/wordml/symex" xmlns:wpg="http://schemas.microsoft.com/office/word/2010/wordprocessingGroup" xmlns:wpi="http://schemas.microsoft.com/office/word/2010/wordprocessingInk" xmlns:wne="http://schemas.microsoft.com/office/word/2006/wordml" xmlns:wps="http://schemas.microsoft.com/office/word/2010/wordprocessingShape" mc:Ignorable="w14 w15 w16se w16cid wp14">
   <w:p>
     <w:pPr>
       <w:pStyle w:val="normal1"/>
@@ -1252,7 +1413,7 @@
 </file>
 
 <file path=word/header3.xml><?xml version="1.0" encoding="utf-8"?>
-<w:hdr xmlns:wpc="http://schemas.microsoft.com/office/word/2010/wordprocessingCanvas" xmlns:cx="http://schemas.microsoft.com/office/drawing/2014/chartex" xmlns:cx1="http://schemas.microsoft.com/office/drawing/2015/9/8/chartex" xmlns:cx2="http://schemas.microsoft.com/office/drawing/2015/10/21/chartex" xmlns:cx3="http://schemas.microsoft.com/office/drawing/2016/5/9/chartex" xmlns:cx4="http://schemas.microsoft.com/office/drawing/2016/5/10/chartex" xmlns:cx5="http://schemas.microsoft.com/office/drawing/2016/5/11/chartex" xmlns:cx6="http://schemas.microsoft.com/office/drawing/2016/5/12/chartex" xmlns:cx7="http://schemas.microsoft.com/office/drawing/2016/5/13/chartex" xmlns:cx8="http://schemas.microsoft.com/office/drawing/2016/5/14/chartex" xmlns:mc="http://schemas.openxmlformats.org/markup-compatibility/2006" xmlns:m="http://schemas.openxmlformats.org/officeDocument/2006/math" xmlns:aink="http://schemas.microsoft.com/office/drawing/2016/ink" xmlns:am3d="http://schemas.microsoft.com/office/drawing/2017/model3d" xmlns:oel="http://schemas.microsoft.com/office/2019/extlst" xmlns:r="http://schemas.openxmlformats.org/officeDocument/2006/relationships" xmlns:wp14="http://schemas.microsoft.com/office/word/2010/wordprocessingDrawing" xmlns:wp="http://schemas.openxmlformats.org/drawingml/2006/wordprocessingDrawing" xmlns:wpg="http://schemas.microsoft.com/office/word/2010/wordprocessingGroup" xmlns:wpi="http://schemas.microsoft.com/office/word/2010/wordprocessingInk" xmlns:wps="http://schemas.microsoft.com/office/word/2010/wordprocessingShape" xmlns:o="urn:schemas-microsoft-com:office:office" xmlns:v="urn:schemas-microsoft-com:vml" xmlns:w10="urn:schemas-microsoft-com:office:word" xmlns:w="http://schemas.openxmlformats.org/wordprocessingml/2006/main" xmlns:w14="http://schemas.microsoft.com/office/word/2010/wordml" xmlns:w15="http://schemas.microsoft.com/office/word/2012/wordml" xmlns:w16cei="http://schemas.microsoft.com/office/word/2026/wordml/cei" xmlns:w16cex="http://schemas.microsoft.com/office/word/2018/wordml/cex" xmlns:w16cid="http://schemas.microsoft.com/office/word/2016/wordml/cid" xmlns:w16="http://schemas.microsoft.com/office/word/2018/wordml" xmlns:w16sdtdh="http://schemas.microsoft.com/office/word/2020/wordml/sdtdatahash" xmlns:w16sdtfl="http://schemas.microsoft.com/office/word/2024/wordml/sdtformatlock" xmlns:w16se="http://schemas.microsoft.com/office/word/2015/wordml/symex" xmlns:w16du="http://schemas.microsoft.com/office/word/2023/wordml/word16du" xmlns:wne="http://schemas.microsoft.com/office/word/2006/wordml" mc:Ignorable="w14 w15 w16se w16cid w16 w16cex w16sdtdh w16sdtfl w16du wp14">
+<w:hdr xmlns:wpc="http://schemas.microsoft.com/office/word/2010/wordprocessingCanvas" xmlns:cx="http://schemas.microsoft.com/office/drawing/2014/chartex" xmlns:cx1="http://schemas.microsoft.com/office/drawing/2015/9/8/chartex" xmlns:cx2="http://schemas.microsoft.com/office/drawing/2015/10/21/chartex" xmlns:cx3="http://schemas.microsoft.com/office/drawing/2016/5/9/chartex" xmlns:cx4="http://schemas.microsoft.com/office/drawing/2016/5/10/chartex" xmlns:cx5="http://schemas.microsoft.com/office/drawing/2016/5/11/chartex" xmlns:cx6="http://schemas.microsoft.com/office/drawing/2016/5/12/chartex" xmlns:cx7="http://schemas.microsoft.com/office/drawing/2016/5/13/chartex" xmlns:cx8="http://schemas.microsoft.com/office/drawing/2016/5/14/chartex" xmlns:mc="http://schemas.openxmlformats.org/markup-compatibility/2006" xmlns:aink="http://schemas.microsoft.com/office/drawing/2016/ink" xmlns:am3d="http://schemas.microsoft.com/office/drawing/2017/model3d" xmlns:o="urn:schemas-microsoft-com:office:office" xmlns:r="http://schemas.openxmlformats.org/officeDocument/2006/relationships" xmlns:m="http://schemas.openxmlformats.org/officeDocument/2006/math" xmlns:v="urn:schemas-microsoft-com:vml" xmlns:wp14="http://schemas.microsoft.com/office/word/2010/wordprocessingDrawing" xmlns:wp="http://schemas.openxmlformats.org/drawingml/2006/wordprocessingDrawing" xmlns:w10="urn:schemas-microsoft-com:office:word" xmlns:w="http://schemas.openxmlformats.org/wordprocessingml/2006/main" xmlns:w14="http://schemas.microsoft.com/office/word/2010/wordml" xmlns:w15="http://schemas.microsoft.com/office/word/2012/wordml" xmlns:w16cid="http://schemas.microsoft.com/office/word/2016/wordml/cid" xmlns:w16se="http://schemas.microsoft.com/office/word/2015/wordml/symex" xmlns:wpg="http://schemas.microsoft.com/office/word/2010/wordprocessingGroup" xmlns:wpi="http://schemas.microsoft.com/office/word/2010/wordprocessingInk" xmlns:wne="http://schemas.microsoft.com/office/word/2006/wordml" xmlns:wps="http://schemas.microsoft.com/office/word/2010/wordprocessingShape" mc:Ignorable="w14 w15 w16se w16cid wp14">
   <w:p>
     <w:pPr>
       <w:pStyle w:val="normal1"/>
@@ -1262,7 +1423,7 @@
 </file>
 
 <file path=word/numbering.xml><?xml version="1.0" encoding="utf-8"?>
-<w:numbering xmlns:wpc="http://schemas.microsoft.com/office/word/2010/wordprocessingCanvas" xmlns:cx="http://schemas.microsoft.com/office/drawing/2014/chartex" xmlns:cx1="http://schemas.microsoft.com/office/drawing/2015/9/8/chartex" xmlns:cx2="http://schemas.microsoft.com/office/drawing/2015/10/21/chartex" xmlns:cx3="http://schemas.microsoft.com/office/drawing/2016/5/9/chartex" xmlns:cx4="http://schemas.microsoft.com/office/drawing/2016/5/10/chartex" xmlns:cx5="http://schemas.microsoft.com/office/drawing/2016/5/11/chartex" xmlns:cx6="http://schemas.microsoft.com/office/drawing/2016/5/12/chartex" xmlns:cx7="http://schemas.microsoft.com/office/drawing/2016/5/13/chartex" xmlns:cx8="http://schemas.microsoft.com/office/drawing/2016/5/14/chartex" xmlns:mc="http://schemas.openxmlformats.org/markup-compatibility/2006" xmlns:m="http://schemas.openxmlformats.org/officeDocument/2006/math" xmlns:aink="http://schemas.microsoft.com/office/drawing/2016/ink" xmlns:am3d="http://schemas.microsoft.com/office/drawing/2017/model3d" xmlns:oel="http://schemas.microsoft.com/office/2019/extlst" xmlns:r="http://schemas.openxmlformats.org/officeDocument/2006/relationships" xmlns:wp14="http://schemas.microsoft.com/office/word/2010/wordprocessingDrawing" xmlns:wp="http://schemas.openxmlformats.org/drawingml/2006/wordprocessingDrawing" xmlns:wpg="http://schemas.microsoft.com/office/word/2010/wordprocessingGroup" xmlns:wpi="http://schemas.microsoft.com/office/word/2010/wordprocessingInk" xmlns:wps="http://schemas.microsoft.com/office/word/2010/wordprocessingShape" xmlns:o="urn:schemas-microsoft-com:office:office" xmlns:v="urn:schemas-microsoft-com:vml" xmlns:w10="urn:schemas-microsoft-com:office:word" xmlns:w="http://schemas.openxmlformats.org/wordprocessingml/2006/main" xmlns:w14="http://schemas.microsoft.com/office/word/2010/wordml" xmlns:w15="http://schemas.microsoft.com/office/word/2012/wordml" xmlns:w16cei="http://schemas.microsoft.com/office/word/2026/wordml/cei" xmlns:w16cex="http://schemas.microsoft.com/office/word/2018/wordml/cex" xmlns:w16cid="http://schemas.microsoft.com/office/word/2016/wordml/cid" xmlns:w16="http://schemas.microsoft.com/office/word/2018/wordml" xmlns:w16sdtdh="http://schemas.microsoft.com/office/word/2020/wordml/sdtdatahash" xmlns:w16sdtfl="http://schemas.microsoft.com/office/word/2024/wordml/sdtformatlock" xmlns:w16se="http://schemas.microsoft.com/office/word/2015/wordml/symex" xmlns:w16du="http://schemas.microsoft.com/office/word/2023/wordml/word16du" xmlns:wne="http://schemas.microsoft.com/office/word/2006/wordml" mc:Ignorable="w14 w15 w16se w16cid w16 w16cex w16sdtdh w16sdtfl w16du wp14">
+<w:numbering xmlns:wpc="http://schemas.microsoft.com/office/word/2010/wordprocessingCanvas" xmlns:cx="http://schemas.microsoft.com/office/drawing/2014/chartex" xmlns:cx1="http://schemas.microsoft.com/office/drawing/2015/9/8/chartex" xmlns:cx2="http://schemas.microsoft.com/office/drawing/2015/10/21/chartex" xmlns:cx3="http://schemas.microsoft.com/office/drawing/2016/5/9/chartex" xmlns:cx4="http://schemas.microsoft.com/office/drawing/2016/5/10/chartex" xmlns:cx5="http://schemas.microsoft.com/office/drawing/2016/5/11/chartex" xmlns:cx6="http://schemas.microsoft.com/office/drawing/2016/5/12/chartex" xmlns:cx7="http://schemas.microsoft.com/office/drawing/2016/5/13/chartex" xmlns:cx8="http://schemas.microsoft.com/office/drawing/2016/5/14/chartex" xmlns:mc="http://schemas.openxmlformats.org/markup-compatibility/2006" xmlns:aink="http://schemas.microsoft.com/office/drawing/2016/ink" xmlns:am3d="http://schemas.microsoft.com/office/drawing/2017/model3d" xmlns:o="urn:schemas-microsoft-com:office:office" xmlns:r="http://schemas.openxmlformats.org/officeDocument/2006/relationships" xmlns:m="http://schemas.openxmlformats.org/officeDocument/2006/math" xmlns:v="urn:schemas-microsoft-com:vml" xmlns:wp14="http://schemas.microsoft.com/office/word/2010/wordprocessingDrawing" xmlns:wp="http://schemas.openxmlformats.org/drawingml/2006/wordprocessingDrawing" xmlns:w10="urn:schemas-microsoft-com:office:word" xmlns:w="http://schemas.openxmlformats.org/wordprocessingml/2006/main" xmlns:w14="http://schemas.microsoft.com/office/word/2010/wordml" xmlns:w15="http://schemas.microsoft.com/office/word/2012/wordml" xmlns:w16cid="http://schemas.microsoft.com/office/word/2016/wordml/cid" xmlns:w16se="http://schemas.microsoft.com/office/word/2015/wordml/symex" xmlns:wpg="http://schemas.microsoft.com/office/word/2010/wordprocessingGroup" xmlns:wpi="http://schemas.microsoft.com/office/word/2010/wordprocessingInk" xmlns:wne="http://schemas.microsoft.com/office/word/2006/wordml" xmlns:wps="http://schemas.microsoft.com/office/word/2010/wordprocessingShape" mc:Ignorable="w14 w15 w16se w16cid wp14">
   <w:abstractNum w:abstractNumId="0" w15:restartNumberingAfterBreak="0">
     <w:nsid w:val="04585ACD"/>
     <w:multiLevelType w:val="multilevel"/>
@@ -4078,74 +4239,82 @@
       </w:rPr>
     </w:lvl>
   </w:abstractNum>
-  <w:num w:numId="1" w16cid:durableId="448626049">
+  <w:num w:numId="1">
     <w:abstractNumId w:val="0"/>
   </w:num>
-  <w:num w:numId="2" w16cid:durableId="423456442">
+  <w:num w:numId="2">
     <w:abstractNumId w:val="4"/>
   </w:num>
-  <w:num w:numId="3" w16cid:durableId="1307012867">
+  <w:num w:numId="3">
     <w:abstractNumId w:val="15"/>
   </w:num>
-  <w:num w:numId="4" w16cid:durableId="843787283">
+  <w:num w:numId="4">
     <w:abstractNumId w:val="3"/>
   </w:num>
-  <w:num w:numId="5" w16cid:durableId="943461482">
+  <w:num w:numId="5">
     <w:abstractNumId w:val="5"/>
   </w:num>
-  <w:num w:numId="6" w16cid:durableId="499083406">
+  <w:num w:numId="6">
     <w:abstractNumId w:val="18"/>
   </w:num>
-  <w:num w:numId="7" w16cid:durableId="585069309">
+  <w:num w:numId="7">
     <w:abstractNumId w:val="13"/>
   </w:num>
-  <w:num w:numId="8" w16cid:durableId="543104767">
+  <w:num w:numId="8">
     <w:abstractNumId w:val="2"/>
   </w:num>
-  <w:num w:numId="9" w16cid:durableId="299697226">
+  <w:num w:numId="9">
     <w:abstractNumId w:val="17"/>
   </w:num>
-  <w:num w:numId="10" w16cid:durableId="1890803704">
+  <w:num w:numId="10">
     <w:abstractNumId w:val="7"/>
   </w:num>
-  <w:num w:numId="11" w16cid:durableId="2029677037">
+  <w:num w:numId="11">
     <w:abstractNumId w:val="9"/>
   </w:num>
-  <w:num w:numId="12" w16cid:durableId="384305656">
+  <w:num w:numId="12">
     <w:abstractNumId w:val="19"/>
   </w:num>
-  <w:num w:numId="13" w16cid:durableId="2145853459">
+  <w:num w:numId="13">
     <w:abstractNumId w:val="6"/>
   </w:num>
-  <w:num w:numId="14" w16cid:durableId="531773410">
+  <w:num w:numId="14">
     <w:abstractNumId w:val="16"/>
   </w:num>
-  <w:num w:numId="15" w16cid:durableId="2135638060">
+  <w:num w:numId="15">
     <w:abstractNumId w:val="1"/>
   </w:num>
-  <w:num w:numId="16" w16cid:durableId="213468746">
+  <w:num w:numId="16">
     <w:abstractNumId w:val="16"/>
   </w:num>
-  <w:num w:numId="17" w16cid:durableId="16198036">
+  <w:num w:numId="17">
     <w:abstractNumId w:val="12"/>
   </w:num>
-  <w:num w:numId="18" w16cid:durableId="185796897">
+  <w:num w:numId="18">
     <w:abstractNumId w:val="8"/>
   </w:num>
-  <w:num w:numId="19" w16cid:durableId="2116903988">
+  <w:num w:numId="19">
     <w:abstractNumId w:val="11"/>
   </w:num>
-  <w:num w:numId="20" w16cid:durableId="1383673683">
+  <w:num w:numId="20">
     <w:abstractNumId w:val="14"/>
   </w:num>
-  <w:num w:numId="21" w16cid:durableId="984703937">
+  <w:num w:numId="21">
     <w:abstractNumId w:val="10"/>
   </w:num>
 </w:numbering>
 </file>
 
+<file path=word/people.xml><?xml version="1.0" encoding="utf-8"?>
+<w15:people xmlns:wpc="http://schemas.microsoft.com/office/word/2010/wordprocessingCanvas" xmlns:cx="http://schemas.microsoft.com/office/drawing/2014/chartex" xmlns:cx1="http://schemas.microsoft.com/office/drawing/2015/9/8/chartex" xmlns:cx2="http://schemas.microsoft.com/office/drawing/2015/10/21/chartex" xmlns:cx3="http://schemas.microsoft.com/office/drawing/2016/5/9/chartex" xmlns:cx4="http://schemas.microsoft.com/office/drawing/2016/5/10/chartex" xmlns:cx5="http://schemas.microsoft.com/office/drawing/2016/5/11/chartex" xmlns:cx6="http://schemas.microsoft.com/office/drawing/2016/5/12/chartex" xmlns:cx7="http://schemas.microsoft.com/office/drawing/2016/5/13/chartex" xmlns:cx8="http://schemas.microsoft.com/office/drawing/2016/5/14/chartex" xmlns:mc="http://schemas.openxmlformats.org/markup-compatibility/2006" xmlns:aink="http://schemas.microsoft.com/office/drawing/2016/ink" xmlns:am3d="http://schemas.microsoft.com/office/drawing/2017/model3d" xmlns:o="urn:schemas-microsoft-com:office:office" xmlns:r="http://schemas.openxmlformats.org/officeDocument/2006/relationships" xmlns:m="http://schemas.openxmlformats.org/officeDocument/2006/math" xmlns:v="urn:schemas-microsoft-com:vml" xmlns:wp14="http://schemas.microsoft.com/office/word/2010/wordprocessingDrawing" xmlns:wp="http://schemas.openxmlformats.org/drawingml/2006/wordprocessingDrawing" xmlns:w10="urn:schemas-microsoft-com:office:word" xmlns:w="http://schemas.openxmlformats.org/wordprocessingml/2006/main" xmlns:w14="http://schemas.microsoft.com/office/word/2010/wordml" xmlns:w15="http://schemas.microsoft.com/office/word/2012/wordml" xmlns:w16cid="http://schemas.microsoft.com/office/word/2016/wordml/cid" xmlns:w16se="http://schemas.microsoft.com/office/word/2015/wordml/symex" xmlns:wpg="http://schemas.microsoft.com/office/word/2010/wordprocessingGroup" xmlns:wpi="http://schemas.microsoft.com/office/word/2010/wordprocessingInk" xmlns:wne="http://schemas.microsoft.com/office/word/2006/wordml" xmlns:wps="http://schemas.microsoft.com/office/word/2010/wordprocessingShape" mc:Ignorable="w14 w15 w16se w16cid wp14">
+  <w15:person w15:author="Jessica Lewis">
+    <w15:presenceInfo w15:providerId="AD" w15:userId="S-1-5-21-2764574493-1171543700-3021316721-1730"/>
+  </w15:person>
+</w15:people>
+</file>
+
 <file path=word/styles.xml><?xml version="1.0" encoding="utf-8"?>
-<w:styles xmlns:mc="http://schemas.openxmlformats.org/markup-compatibility/2006" xmlns:r="http://schemas.openxmlformats.org/officeDocument/2006/relationships" xmlns:w="http://schemas.openxmlformats.org/wordprocessingml/2006/main" xmlns:w14="http://schemas.microsoft.com/office/word/2010/wordml" xmlns:w15="http://schemas.microsoft.com/office/word/2012/wordml" xmlns:w16cex="http://schemas.microsoft.com/office/word/2018/wordml/cex" xmlns:w16cid="http://schemas.microsoft.com/office/word/2016/wordml/cid" xmlns:w16="http://schemas.microsoft.com/office/word/2018/wordml" xmlns:w16sdtdh="http://schemas.microsoft.com/office/word/2020/wordml/sdtdatahash" xmlns:w16sdtfl="http://schemas.microsoft.com/office/word/2024/wordml/sdtformatlock" xmlns:w16se="http://schemas.microsoft.com/office/word/2015/wordml/symex" xmlns:w16du="http://schemas.microsoft.com/office/word/2023/wordml/word16du" mc:Ignorable="w14 w15 w16se w16cid w16 w16cex w16sdtdh w16sdtfl w16du">
+<w:styles xmlns:mc="http://schemas.openxmlformats.org/markup-compatibility/2006" xmlns:r="http://schemas.openxmlformats.org/officeDocument/2006/relationships" xmlns:w="http://schemas.openxmlformats.org/wordprocessingml/2006/main" xmlns:w14="http://schemas.microsoft.com/office/word/2010/wordml" xmlns:w15="http://schemas.microsoft.com/office/word/2012/wordml" xmlns:w16cid="http://schemas.microsoft.com/office/word/2016/wordml/cid" xmlns:w16se="http://schemas.microsoft.com/office/word/2015/wordml/symex" mc:Ignorable="w14 w15 w16se w16cid">
   <w:docDefaults>
     <w:rPrDefault>
       <w:rPr>
@@ -4157,7 +4326,7 @@
     </w:rPrDefault>
     <w:pPrDefault/>
   </w:docDefaults>
-  <w:latentStyles w:defLockedState="0" w:defUIPriority="99" w:defSemiHidden="0" w:defUnhideWhenUsed="0" w:defQFormat="0" w:count="376">
+  <w:latentStyles w:defLockedState="0" w:defUIPriority="99" w:defSemiHidden="0" w:defUnhideWhenUsed="0" w:defQFormat="0" w:count="375">
     <w:lsdException w:name="Normal" w:uiPriority="0" w:qFormat="1"/>
     <w:lsdException w:name="heading 1" w:uiPriority="9" w:qFormat="1"/>
     <w:lsdException w:name="heading 2" w:semiHidden="1" w:uiPriority="9" w:unhideWhenUsed="1" w:qFormat="1"/>
@@ -4533,7 +4702,6 @@
     <w:lsdException w:name="Smart Hyperlink" w:semiHidden="1" w:unhideWhenUsed="1"/>
     <w:lsdException w:name="Hashtag" w:semiHidden="1" w:unhideWhenUsed="1"/>
     <w:lsdException w:name="Unresolved Mention" w:semiHidden="1" w:unhideWhenUsed="1"/>
-    <w:lsdException w:name="Smart Link" w:semiHidden="1" w:unhideWhenUsed="1"/>
   </w:latentStyles>
   <w:style w:type="paragraph" w:default="1" w:styleId="Normal">
     <w:name w:val="Normal"/>
@@ -4705,7 +4873,6 @@
   <w:style w:type="character" w:default="1" w:styleId="DefaultParagraphFont">
     <w:name w:val="Default Paragraph Font"/>
     <w:uiPriority w:val="1"/>
-    <w:semiHidden/>
     <w:unhideWhenUsed/>
   </w:style>
   <w:style w:type="table" w:default="1" w:styleId="TableNormal">
@@ -16045,6 +16212,300 @@
 </a:theme>
 </file>
 
+<file path=customXml/item1.xml><?xml version="1.0" encoding="utf-8"?>
+<ct:contentTypeSchema xmlns:ct="http://schemas.microsoft.com/office/2006/metadata/contentType" xmlns:ma="http://schemas.microsoft.com/office/2006/metadata/properties/metaAttributes" ct:_="" ma:_="" ma:contentTypeName="Document" ma:contentTypeID="0x010100864F493571915748917EFA9FA4EC90EF" ma:contentTypeVersion="15" ma:contentTypeDescription="Create a new document." ma:contentTypeScope="" ma:versionID="b55410b1a5629cf24fd5c7183c011b84">
+  <xsd:schema xmlns:xsd="http://www.w3.org/2001/XMLSchema" xmlns:xs="http://www.w3.org/2001/XMLSchema" xmlns:p="http://schemas.microsoft.com/office/2006/metadata/properties" xmlns:ns3="962ef77b-2882-4348-a3e2-6d9f32a78508" xmlns:ns4="5e5d38c4-b93f-449b-baa9-0bbd6b5883b9" targetNamespace="http://schemas.microsoft.com/office/2006/metadata/properties" ma:root="true" ma:fieldsID="9e9879396e3a31b2a91d78539cb9fb8c" ns3:_="" ns4:_="">
+    <xsd:import namespace="962ef77b-2882-4348-a3e2-6d9f32a78508"/>
+    <xsd:import namespace="5e5d38c4-b93f-449b-baa9-0bbd6b5883b9"/>
+    <xsd:element name="properties">
+      <xsd:complexType>
+        <xsd:sequence>
+          <xsd:element name="documentManagement">
+            <xsd:complexType>
+              <xsd:all>
+                <xsd:element ref="ns3:MediaServiceMetadata" minOccurs="0"/>
+                <xsd:element ref="ns3:MediaServiceFastMetadata" minOccurs="0"/>
+                <xsd:element ref="ns4:SharedWithUsers" minOccurs="0"/>
+                <xsd:element ref="ns4:SharedWithDetails" minOccurs="0"/>
+                <xsd:element ref="ns4:SharingHintHash" minOccurs="0"/>
+                <xsd:element ref="ns3:MediaServiceObjectDetectorVersions" minOccurs="0"/>
+                <xsd:element ref="ns3:MediaServiceSearchProperties" minOccurs="0"/>
+                <xsd:element ref="ns3:MediaServiceDateTaken" minOccurs="0"/>
+                <xsd:element ref="ns3:MediaServiceGenerationTime" minOccurs="0"/>
+                <xsd:element ref="ns3:MediaServiceEventHashCode" minOccurs="0"/>
+                <xsd:element ref="ns3:MediaServiceSystemTags" minOccurs="0"/>
+                <xsd:element ref="ns3:MediaServiceLocation" minOccurs="0"/>
+                <xsd:element ref="ns3:MediaServiceOCR" minOccurs="0"/>
+                <xsd:element ref="ns3:_activity" minOccurs="0"/>
+                <xsd:element ref="ns3:MediaLengthInSeconds" minOccurs="0"/>
+              </xsd:all>
+            </xsd:complexType>
+          </xsd:element>
+        </xsd:sequence>
+      </xsd:complexType>
+    </xsd:element>
+  </xsd:schema>
+  <xsd:schema xmlns:xsd="http://www.w3.org/2001/XMLSchema" xmlns:xs="http://www.w3.org/2001/XMLSchema" xmlns:dms="http://schemas.microsoft.com/office/2006/documentManagement/types" xmlns:pc="http://schemas.microsoft.com/office/infopath/2007/PartnerControls" targetNamespace="962ef77b-2882-4348-a3e2-6d9f32a78508" elementFormDefault="qualified">
+    <xsd:import namespace="http://schemas.microsoft.com/office/2006/documentManagement/types"/>
+    <xsd:import namespace="http://schemas.microsoft.com/office/infopath/2007/PartnerControls"/>
+    <xsd:element name="MediaServiceMetadata" ma:index="8" nillable="true" ma:displayName="MediaServiceMetadata" ma:hidden="true" ma:internalName="MediaServiceMetadata" ma:readOnly="true">
+      <xsd:simpleType>
+        <xsd:restriction base="dms:Note"/>
+      </xsd:simpleType>
+    </xsd:element>
+    <xsd:element name="MediaServiceFastMetadata" ma:index="9" nillable="true" ma:displayName="MediaServiceFastMetadata" ma:hidden="true" ma:internalName="MediaServiceFastMetadata" ma:readOnly="true">
+      <xsd:simpleType>
+        <xsd:restriction base="dms:Note"/>
+      </xsd:simpleType>
+    </xsd:element>
+    <xsd:element name="MediaServiceObjectDetectorVersions" ma:index="13" nillable="true" ma:displayName="MediaServiceObjectDetectorVersions" ma:hidden="true" ma:indexed="true" ma:internalName="MediaServiceObjectDetectorVersions" ma:readOnly="true">
+      <xsd:simpleType>
+        <xsd:restriction base="dms:Text"/>
+      </xsd:simpleType>
+    </xsd:element>
+    <xsd:element name="MediaServiceSearchProperties" ma:index="14" nillable="true" ma:displayName="MediaServiceSearchProperties" ma:hidden="true" ma:internalName="MediaServiceSearchProperties" ma:readOnly="true">
+      <xsd:simpleType>
+        <xsd:restriction base="dms:Note"/>
+      </xsd:simpleType>
+    </xsd:element>
+    <xsd:element name="MediaServiceDateTaken" ma:index="15" nillable="true" ma:displayName="MediaServiceDateTaken" ma:hidden="true" ma:indexed="true" ma:internalName="MediaServiceDateTaken" ma:readOnly="true">
+      <xsd:simpleType>
+        <xsd:restriction base="dms:Text"/>
+      </xsd:simpleType>
+    </xsd:element>
+    <xsd:element name="MediaServiceGenerationTime" ma:index="16" nillable="true" ma:displayName="MediaServiceGenerationTime" ma:hidden="true" ma:internalName="MediaServiceGenerationTime" ma:readOnly="true">
+      <xsd:simpleType>
+        <xsd:restriction base="dms:Text"/>
+      </xsd:simpleType>
+    </xsd:element>
+    <xsd:element name="MediaServiceEventHashCode" ma:index="17" nillable="true" ma:displayName="MediaServiceEventHashCode" ma:hidden="true" ma:internalName="MediaServiceEventHashCode" ma:readOnly="true">
+      <xsd:simpleType>
+        <xsd:restriction base="dms:Text"/>
+      </xsd:simpleType>
+    </xsd:element>
+    <xsd:element name="MediaServiceSystemTags" ma:index="18" nillable="true" ma:displayName="MediaServiceSystemTags" ma:hidden="true" ma:internalName="MediaServiceSystemTags" ma:readOnly="true">
+      <xsd:simpleType>
+        <xsd:restriction base="dms:Note"/>
+      </xsd:simpleType>
+    </xsd:element>
+    <xsd:element name="MediaServiceLocation" ma:index="19" nillable="true" ma:displayName="Location" ma:indexed="true" ma:internalName="MediaServiceLocation" ma:readOnly="true">
+      <xsd:simpleType>
+        <xsd:restriction base="dms:Text"/>
+      </xsd:simpleType>
+    </xsd:element>
+    <xsd:element name="MediaServiceOCR" ma:index="20" nillable="true" ma:displayName="Extracted Text" ma:internalName="MediaServiceOCR" ma:readOnly="true">
+      <xsd:simpleType>
+        <xsd:restriction base="dms:Note">
+          <xsd:maxLength value="255"/>
+        </xsd:restriction>
+      </xsd:simpleType>
+    </xsd:element>
+    <xsd:element name="_activity" ma:index="21" nillable="true" ma:displayName="_activity" ma:hidden="true" ma:internalName="_activity">
+      <xsd:simpleType>
+        <xsd:restriction base="dms:Note"/>
+      </xsd:simpleType>
+    </xsd:element>
+    <xsd:element name="MediaLengthInSeconds" ma:index="22" nillable="true" ma:displayName="MediaLengthInSeconds" ma:hidden="true" ma:internalName="MediaLengthInSeconds" ma:readOnly="true">
+      <xsd:simpleType>
+        <xsd:restriction base="dms:Unknown"/>
+      </xsd:simpleType>
+    </xsd:element>
+  </xsd:schema>
+  <xsd:schema xmlns:xsd="http://www.w3.org/2001/XMLSchema" xmlns:xs="http://www.w3.org/2001/XMLSchema" xmlns:dms="http://schemas.microsoft.com/office/2006/documentManagement/types" xmlns:pc="http://schemas.microsoft.com/office/infopath/2007/PartnerControls" targetNamespace="5e5d38c4-b93f-449b-baa9-0bbd6b5883b9" elementFormDefault="qualified">
+    <xsd:import namespace="http://schemas.microsoft.com/office/2006/documentManagement/types"/>
+    <xsd:import namespace="http://schemas.microsoft.com/office/infopath/2007/PartnerControls"/>
+    <xsd:element name="SharedWithUsers" ma:index="10" nillable="true" ma:displayName="Shared With" ma:internalName="SharedWithUsers" ma:readOnly="true">
+      <xsd:complexType>
+        <xsd:complexContent>
+          <xsd:extension base="dms:UserMulti">
+            <xsd:sequence>
+              <xsd:element name="UserInfo" minOccurs="0" maxOccurs="unbounded">
+                <xsd:complexType>
+                  <xsd:sequence>
+                    <xsd:element name="DisplayName" type="xsd:string" minOccurs="0"/>
+                    <xsd:element name="AccountId" type="dms:UserId" minOccurs="0" nillable="true"/>
+                    <xsd:element name="AccountType" type="xsd:string" minOccurs="0"/>
+                  </xsd:sequence>
+                </xsd:complexType>
+              </xsd:element>
+            </xsd:sequence>
+          </xsd:extension>
+        </xsd:complexContent>
+      </xsd:complexType>
+    </xsd:element>
+    <xsd:element name="SharedWithDetails" ma:index="11" nillable="true" ma:displayName="Shared With Details" ma:internalName="SharedWithDetails" ma:readOnly="true">
+      <xsd:simpleType>
+        <xsd:restriction base="dms:Note">
+          <xsd:maxLength value="255"/>
+        </xsd:restriction>
+      </xsd:simpleType>
+    </xsd:element>
+    <xsd:element name="SharingHintHash" ma:index="12" nillable="true" ma:displayName="Sharing Hint Hash" ma:hidden="true" ma:internalName="SharingHintHash" ma:readOnly="true">
+      <xsd:simpleType>
+        <xsd:restriction base="dms:Text"/>
+      </xsd:simpleType>
+    </xsd:element>
+  </xsd:schema>
+  <xsd:schema xmlns="http://schemas.openxmlformats.org/package/2006/metadata/core-properties" xmlns:xsd="http://www.w3.org/2001/XMLSchema" xmlns:xsi="http://www.w3.org/2001/XMLSchema-instance" xmlns:dc="http://purl.org/dc/elements/1.1/" xmlns:dcterms="http://purl.org/dc/terms/" xmlns:odoc="http://schemas.microsoft.com/internal/obd" targetNamespace="http://schemas.openxmlformats.org/package/2006/metadata/core-properties" elementFormDefault="qualified" attributeFormDefault="unqualified" blockDefault="#all">
+    <xsd:import namespace="http://purl.org/dc/elements/1.1/" schemaLocation="http://dublincore.org/schemas/xmls/qdc/2003/04/02/dc.xsd"/>
+    <xsd:import namespace="http://purl.org/dc/terms/" schemaLocation="http://dublincore.org/schemas/xmls/qdc/2003/04/02/dcterms.xsd"/>
+    <xsd:element name="coreProperties" type="CT_coreProperties"/>
+    <xsd:complexType name="CT_coreProperties">
+      <xsd:all>
+        <xsd:element ref="dc:creator" minOccurs="0" maxOccurs="1"/>
+        <xsd:element ref="dcterms:created" minOccurs="0" maxOccurs="1"/>
+        <xsd:element ref="dc:identifier" minOccurs="0" maxOccurs="1"/>
+        <xsd:element name="contentType" minOccurs="0" maxOccurs="1" type="xsd:string" ma:index="0" ma:displayName="Content Type"/>
+        <xsd:element ref="dc:title" minOccurs="0" maxOccurs="1" ma:index="4" ma:displayName="Title"/>
+        <xsd:element ref="dc:subject" minOccurs="0" maxOccurs="1"/>
+        <xsd:element ref="dc:description" minOccurs="0" maxOccurs="1"/>
+        <xsd:element name="keywords" minOccurs="0" maxOccurs="1" type="xsd:string"/>
+        <xsd:element ref="dc:language" minOccurs="0" maxOccurs="1"/>
+        <xsd:element name="category" minOccurs="0" maxOccurs="1" type="xsd:string"/>
+        <xsd:element name="version" minOccurs="0" maxOccurs="1" type="xsd:string"/>
+        <xsd:element name="revision" minOccurs="0" maxOccurs="1" type="xsd:string">
+          <xsd:annotation>
+            <xsd:documentation>
+                        This value indicates the number of saves or revisions. The application is responsible for updating this value after each revision.
+                    </xsd:documentation>
+          </xsd:annotation>
+        </xsd:element>
+        <xsd:element name="lastModifiedBy" minOccurs="0" maxOccurs="1" type="xsd:string"/>
+        <xsd:element ref="dcterms:modified" minOccurs="0" maxOccurs="1"/>
+        <xsd:element name="contentStatus" minOccurs="0" maxOccurs="1" type="xsd:string"/>
+      </xsd:all>
+    </xsd:complexType>
+  </xsd:schema>
+  <xs:schema xmlns:pc="http://schemas.microsoft.com/office/infopath/2007/PartnerControls" xmlns:xs="http://www.w3.org/2001/XMLSchema" targetNamespace="http://schemas.microsoft.com/office/infopath/2007/PartnerControls" elementFormDefault="qualified" attributeFormDefault="unqualified">
+    <xs:element name="Person">
+      <xs:complexType>
+        <xs:sequence>
+          <xs:element ref="pc:DisplayName" minOccurs="0"/>
+          <xs:element ref="pc:AccountId" minOccurs="0"/>
+          <xs:element ref="pc:AccountType" minOccurs="0"/>
+        </xs:sequence>
+      </xs:complexType>
+    </xs:element>
+    <xs:element name="DisplayName" type="xs:string"/>
+    <xs:element name="AccountId" type="xs:string"/>
+    <xs:element name="AccountType" type="xs:string"/>
+    <xs:element name="BDCAssociatedEntity">
+      <xs:complexType>
+        <xs:sequence>
+          <xs:element ref="pc:BDCEntity" minOccurs="0" maxOccurs="unbounded"/>
+        </xs:sequence>
+        <xs:attribute ref="pc:EntityNamespace"/>
+        <xs:attribute ref="pc:EntityName"/>
+        <xs:attribute ref="pc:SystemInstanceName"/>
+        <xs:attribute ref="pc:AssociationName"/>
+      </xs:complexType>
+    </xs:element>
+    <xs:attribute name="EntityNamespace" type="xs:string"/>
+    <xs:attribute name="EntityName" type="xs:string"/>
+    <xs:attribute name="SystemInstanceName" type="xs:string"/>
+    <xs:attribute name="AssociationName" type="xs:string"/>
+    <xs:element name="BDCEntity">
+      <xs:complexType>
+        <xs:sequence>
+          <xs:element ref="pc:EntityDisplayName" minOccurs="0"/>
+          <xs:element ref="pc:EntityInstanceReference" minOccurs="0"/>
+          <xs:element ref="pc:EntityId1" minOccurs="0"/>
+          <xs:element ref="pc:EntityId2" minOccurs="0"/>
+          <xs:element ref="pc:EntityId3" minOccurs="0"/>
+          <xs:element ref="pc:EntityId4" minOccurs="0"/>
+          <xs:element ref="pc:EntityId5" minOccurs="0"/>
+        </xs:sequence>
+      </xs:complexType>
+    </xs:element>
+    <xs:element name="EntityDisplayName" type="xs:string"/>
+    <xs:element name="EntityInstanceReference" type="xs:string"/>
+    <xs:element name="EntityId1" type="xs:string"/>
+    <xs:element name="EntityId2" type="xs:string"/>
+    <xs:element name="EntityId3" type="xs:string"/>
+    <xs:element name="EntityId4" type="xs:string"/>
+    <xs:element name="EntityId5" type="xs:string"/>
+    <xs:element name="Terms">
+      <xs:complexType>
+        <xs:sequence>
+          <xs:element ref="pc:TermInfo" minOccurs="0" maxOccurs="unbounded"/>
+        </xs:sequence>
+      </xs:complexType>
+    </xs:element>
+    <xs:element name="TermInfo">
+      <xs:complexType>
+        <xs:sequence>
+          <xs:element ref="pc:TermName" minOccurs="0"/>
+          <xs:element ref="pc:TermId" minOccurs="0"/>
+        </xs:sequence>
+      </xs:complexType>
+    </xs:element>
+    <xs:element name="TermName" type="xs:string"/>
+    <xs:element name="TermId" type="xs:string"/>
+  </xs:schema>
+</ct:contentTypeSchema>
+</file>
+
+<file path=customXml/item2.xml><?xml version="1.0" encoding="utf-8"?>
+<?mso-contentType ?>
+<FormTemplates xmlns="http://schemas.microsoft.com/sharepoint/v3/contenttype/forms">
+  <Display>DocumentLibraryForm</Display>
+  <Edit>DocumentLibraryForm</Edit>
+  <New>DocumentLibraryForm</New>
+</FormTemplates>
+</file>
+
+<file path=customXml/item3.xml><?xml version="1.0" encoding="utf-8"?>
+<p:properties xmlns:p="http://schemas.microsoft.com/office/2006/metadata/properties" xmlns:xsi="http://www.w3.org/2001/XMLSchema-instance" xmlns:pc="http://schemas.microsoft.com/office/infopath/2007/PartnerControls">
+  <documentManagement>
+    <_activity xmlns="962ef77b-2882-4348-a3e2-6d9f32a78508" xsi:nil="true"/>
+  </documentManagement>
+</p:properties>
+</file>
+
+<file path=customXml/itemProps1.xml><?xml version="1.0" encoding="utf-8"?>
+<ds:datastoreItem xmlns:ds="http://schemas.openxmlformats.org/officeDocument/2006/customXml" ds:itemID="{CCAF5426-05F2-48DD-A158-6FD28BAB0179}">
+  <ds:schemaRefs>
+    <ds:schemaRef ds:uri="http://schemas.microsoft.com/office/2006/metadata/contentType"/>
+    <ds:schemaRef ds:uri="http://schemas.microsoft.com/office/2006/metadata/properties/metaAttributes"/>
+    <ds:schemaRef ds:uri="http://www.w3.org/2001/XMLSchema"/>
+    <ds:schemaRef ds:uri="http://schemas.microsoft.com/office/2006/metadata/properties"/>
+    <ds:schemaRef ds:uri="962ef77b-2882-4348-a3e2-6d9f32a78508"/>
+    <ds:schemaRef ds:uri="5e5d38c4-b93f-449b-baa9-0bbd6b5883b9"/>
+    <ds:schemaRef ds:uri="http://schemas.microsoft.com/office/2006/documentManagement/types"/>
+    <ds:schemaRef ds:uri="http://schemas.microsoft.com/office/infopath/2007/PartnerControls"/>
+    <ds:schemaRef ds:uri="http://schemas.openxmlformats.org/package/2006/metadata/core-properties"/>
+    <ds:schemaRef ds:uri="http://purl.org/dc/elements/1.1/"/>
+    <ds:schemaRef ds:uri="http://purl.org/dc/terms/"/>
+    <ds:schemaRef ds:uri="http://schemas.microsoft.com/internal/obd"/>
+  </ds:schemaRefs>
+</ds:datastoreItem>
+</file>
+
+<file path=customXml/itemProps2.xml><?xml version="1.0" encoding="utf-8"?>
+<ds:datastoreItem xmlns:ds="http://schemas.openxmlformats.org/officeDocument/2006/customXml" ds:itemID="{843F1E5B-5D62-4FBB-B0C4-C8FE96CD9004}">
+  <ds:schemaRefs>
+    <ds:schemaRef ds:uri="http://schemas.microsoft.com/sharepoint/v3/contenttype/forms"/>
+  </ds:schemaRefs>
+</ds:datastoreItem>
+</file>
+
+<file path=customXml/itemProps3.xml><?xml version="1.0" encoding="utf-8"?>
+<ds:datastoreItem xmlns:ds="http://schemas.openxmlformats.org/officeDocument/2006/customXml" ds:itemID="{2B97ABA1-E94A-4696-8070-4C5F7599D96E}">
+  <ds:schemaRefs>
+    <ds:schemaRef ds:uri="http://purl.org/dc/terms/"/>
+    <ds:schemaRef ds:uri="http://purl.org/dc/elements/1.1/"/>
+    <ds:schemaRef ds:uri="http://schemas.microsoft.com/office/2006/documentManagement/types"/>
+    <ds:schemaRef ds:uri="http://www.w3.org/XML/1998/namespace"/>
+    <ds:schemaRef ds:uri="5e5d38c4-b93f-449b-baa9-0bbd6b5883b9"/>
+    <ds:schemaRef ds:uri="http://schemas.microsoft.com/office/2006/metadata/properties"/>
+    <ds:schemaRef ds:uri="http://schemas.microsoft.com/office/infopath/2007/PartnerControls"/>
+    <ds:schemaRef ds:uri="http://schemas.openxmlformats.org/package/2006/metadata/core-properties"/>
+    <ds:schemaRef ds:uri="962ef77b-2882-4348-a3e2-6d9f32a78508"/>
+    <ds:schemaRef ds:uri="http://purl.org/dc/dcmitype/"/>
+  </ds:schemaRefs>
+</ds:datastoreItem>
+</file>
+
 <file path=docMetadata/LabelInfo.xml><?xml version="1.0" encoding="utf-8"?>
 <clbl:labelList xmlns:clbl="http://schemas.microsoft.com/office/2020/mipLabelMetadata">
   <clbl:label id="{81e0f09a-6605-4cdc-b70c-67d2aea670a0}" enabled="1" method="Standard" siteId="{5d135798-0ae4-4f20-a663-a223e2cd1f4e}" contentBits="2" removed="0"/>

</xml_diff>